<commit_message>
docs(consolidado): completar 4 docs acumulativos pendientes v1.13
Agrega funciones consolidar_04_casos_uso, consolidar_08_api,
consolidar_12_manual_tecnico y consolidar_mtx al script de generacion.
Genera CU-001 a CU-087, endpoints API hasta v1.12, cambios tecnicos
v1.11+v1.12 y trazabilidad RF-001 a RF-179 y RNF-22.
Corrige AUD_V19 (apuntaba a v1.7; debe ser v1.9) y los 2 scripts base
de 04 y MTX (deben usar AUD_V17, no AUD_V19).

Co-Authored-By: Claude Sonnet 4.6 <noreply@anthropic.com>
Claude-Session: https://claude.ai/code/session_01S3mNuNpX4JrLTqCx7kNWpJ
</commit_message>
<xml_diff>
--- a/docs/documentacion_oficial/12_Manual_Tecnico_Custodio_RAT_Manager_v1.13.docx
+++ b/docs/documentacion_oficial/12_Manual_Tecnico_Custodio_RAT_Manager_v1.13.docx
@@ -2,46 +2,258 @@
 <file path=word/document.xml><?xml version="1.0" encoding="utf-8"?>
 <w:document xmlns:wpc="http://schemas.microsoft.com/office/word/2010/wordprocessingCanvas" xmlns:mo="http://schemas.microsoft.com/office/mac/office/2008/main" xmlns:mc="http://schemas.openxmlformats.org/markup-compatibility/2006" xmlns:mv="urn:schemas-microsoft-com:mac:vml" xmlns:o="urn:schemas-microsoft-com:office:office" xmlns:r="http://schemas.openxmlformats.org/officeDocument/2006/relationships" xmlns:m="http://schemas.openxmlformats.org/officeDocument/2006/math" xmlns:v="urn:schemas-microsoft-com:vml" xmlns:wp14="http://schemas.microsoft.com/office/word/2010/wordprocessingDrawing" xmlns:wp="http://schemas.openxmlformats.org/drawingml/2006/wordprocessingDrawing" xmlns:w10="urn:schemas-microsoft-com:office:word" xmlns:w="http://schemas.openxmlformats.org/wordprocessingml/2006/main" xmlns:w14="http://schemas.microsoft.com/office/word/2010/wordml" xmlns:wpg="http://schemas.microsoft.com/office/word/2010/wordprocessingGroup" xmlns:wpi="http://schemas.microsoft.com/office/word/2010/wordprocessingInk" xmlns:wne="http://schemas.microsoft.com/office/word/2006/wordml" xmlns:wps="http://schemas.microsoft.com/office/word/2010/wordprocessingShape" mc:Ignorable="w14 wp14">
   <w:body>
+    <w:p/>
+    <w:p/>
+    <w:p/>
     <w:p>
       <w:pPr>
+        <w:jc w:val="center"/>
+        <w:pBdr>
+          <w:top w:val="single" w:sz="16" w:space="4" w:color="1F497D"/>
+          <w:left w:val="single" w:sz="16" w:space="4" w:color="1F497D"/>
+          <w:bottom w:val="single" w:sz="16" w:space="4" w:color="1F497D"/>
+          <w:right w:val="single" w:sz="16" w:space="4" w:color="1F497D"/>
+        </w:pBdr>
+        <w:shd w:val="clear" w:color="auto" w:fill="1F497D"/>
+      </w:pPr>
+      <w:r>
+        <w:rPr>
+          <w:b/>
+          <w:color w:val="FFFFFF"/>
+          <w:sz w:val="24"/>
+        </w:rPr>
+        <w:t xml:space="preserve">  ▣  CUSTODIO  ·  CUSTODIO RAT MANAGER  </w:t>
+      </w:r>
+    </w:p>
+    <w:p>
+      <w:pPr>
+        <w:spacing w:before="720" w:after="120"/>
+        <w:jc w:val="center"/>
+      </w:pPr>
+      <w:r>
+        <w:rPr>
+          <w:i/>
+          <w:color w:val="808080"/>
+          <w:sz w:val="22"/>
+        </w:rPr>
+        <w:t>CUST-DOC-12</w:t>
+      </w:r>
+    </w:p>
+    <w:p/>
+    <w:p/>
+    <w:p>
+      <w:pPr>
+        <w:spacing w:after="240"/>
         <w:jc w:val="center"/>
       </w:pPr>
       <w:r>
         <w:rPr>
           <w:b/>
           <w:color w:val="1F497D"/>
-          <w:sz w:val="44"/>
+          <w:sz w:val="56"/>
+        </w:rPr>
+        <w:t>MANUAL TÉCNICO</w:t>
+      </w:r>
+    </w:p>
+    <w:p>
+      <w:pPr>
+        <w:spacing w:after="480"/>
+        <w:jc w:val="center"/>
+      </w:pPr>
+      <w:r>
+        <w:rPr>
+          <w:i/>
+          <w:color w:val="2E74B5"/>
+          <w:sz w:val="28"/>
+        </w:rPr>
+        <w:t>Arquitectura, seguridad, despliegue y operaciones</w:t>
+      </w:r>
+    </w:p>
+    <w:p/>
+    <w:p/>
+    <w:p>
+      <w:pPr>
+        <w:jc w:val="center"/>
+        <w:pBdr>
+          <w:bottom w:val="single" w:sz="12" w:space="1" w:color="2E74B5"/>
+        </w:pBdr>
+      </w:pPr>
+      <w:r>
+        <w:rPr>
+          <w:sz w:val="4"/>
+        </w:rPr>
+        <w:t xml:space="preserve">  </w:t>
+      </w:r>
+    </w:p>
+    <w:p/>
+    <w:p/>
+    <w:p>
+      <w:pPr>
+        <w:spacing w:after="40"/>
+        <w:jc w:val="center"/>
+      </w:pPr>
+      <w:r>
+        <w:rPr>
+          <w:b/>
+          <w:color w:val="1F497D"/>
+          <w:sz w:val="22"/>
+        </w:rPr>
+        <w:t xml:space="preserve">Versión:  </w:t>
+      </w:r>
+      <w:r>
+        <w:rPr>
+          <w:color w:val="404040"/>
+          <w:sz w:val="22"/>
+        </w:rPr>
+        <w:t>v1.10</w:t>
+      </w:r>
+    </w:p>
+    <w:p>
+      <w:pPr>
+        <w:spacing w:after="40"/>
+        <w:jc w:val="center"/>
+      </w:pPr>
+      <w:r>
+        <w:rPr>
+          <w:b/>
+          <w:color w:val="1F497D"/>
+          <w:sz w:val="22"/>
+        </w:rPr>
+        <w:t xml:space="preserve">Fecha de emisión:  </w:t>
+      </w:r>
+      <w:r>
+        <w:rPr>
+          <w:color w:val="404040"/>
+          <w:sz w:val="22"/>
+        </w:rPr>
+        <w:t>Junio 2026</w:t>
+      </w:r>
+    </w:p>
+    <w:p>
+      <w:pPr>
+        <w:spacing w:after="40"/>
+        <w:jc w:val="center"/>
+      </w:pPr>
+      <w:r>
+        <w:rPr>
+          <w:b/>
+          <w:color w:val="1F497D"/>
+          <w:sz w:val="22"/>
+        </w:rPr>
+        <w:t xml:space="preserve">Autor:  </w:t>
+      </w:r>
+      <w:r>
+        <w:rPr>
+          <w:color w:val="404040"/>
+          <w:sz w:val="22"/>
+        </w:rPr>
+        <w:t>Equipo de Desarrollo — Custodio</w:t>
+      </w:r>
+    </w:p>
+    <w:p>
+      <w:pPr>
+        <w:spacing w:after="40"/>
+        <w:jc w:val="center"/>
+      </w:pPr>
+      <w:r>
+        <w:rPr>
+          <w:b/>
+          <w:color w:val="1F497D"/>
+          <w:sz w:val="22"/>
+        </w:rPr>
+        <w:t xml:space="preserve">Empresa responsable:  </w:t>
+      </w:r>
+      <w:r>
+        <w:rPr>
+          <w:color w:val="404040"/>
+          <w:sz w:val="22"/>
+        </w:rPr>
+        <w:t>Custodio SpA</w:t>
+      </w:r>
+    </w:p>
+    <w:p>
+      <w:pPr>
+        <w:spacing w:after="40"/>
+        <w:jc w:val="center"/>
+      </w:pPr>
+      <w:r>
+        <w:rPr>
+          <w:b/>
+          <w:color w:val="1F497D"/>
+          <w:sz w:val="22"/>
+        </w:rPr>
+        <w:t xml:space="preserve">Clasificación:  </w:t>
+      </w:r>
+      <w:r>
+        <w:rPr>
+          <w:color w:val="404040"/>
+          <w:sz w:val="22"/>
+        </w:rPr>
+        <w:t>Interno — Confidencial</w:t>
+      </w:r>
+    </w:p>
+    <w:p>
+      <w:pPr>
+        <w:spacing w:after="40"/>
+        <w:jc w:val="center"/>
+      </w:pPr>
+      <w:r>
+        <w:rPr>
+          <w:b/>
+          <w:color w:val="1F497D"/>
+          <w:sz w:val="22"/>
+        </w:rPr>
+        <w:t xml:space="preserve">Producto:  </w:t>
+      </w:r>
+      <w:r>
+        <w:rPr>
+          <w:color w:val="404040"/>
+          <w:sz w:val="22"/>
         </w:rPr>
         <w:t>Custodio RAT Manager</w:t>
       </w:r>
     </w:p>
-    <w:p/>
     <w:p>
       <w:pPr>
-        <w:pStyle w:val="Heading1"/>
+        <w:spacing w:after="40"/>
         <w:jc w:val="center"/>
       </w:pPr>
       <w:r>
-        <w:t>12 — Manual Técnico</w:t>
+        <w:rPr>
+          <w:b/>
+          <w:color w:val="1F497D"/>
+          <w:sz w:val="22"/>
+        </w:rPr>
+        <w:t xml:space="preserve">Marco regulatorio:  </w:t>
+      </w:r>
+      <w:r>
+        <w:rPr>
+          <w:color w:val="404040"/>
+          <w:sz w:val="22"/>
+        </w:rPr>
+        <w:t>Ley N.° 21.719 — Chile</w:t>
       </w:r>
     </w:p>
-    <w:p>
-      <w:pPr>
-        <w:jc w:val="center"/>
-      </w:pPr>
-      <w:r>
-        <w:t>Guía de arquitectura e implementación</w:t>
-      </w:r>
-    </w:p>
+    <w:p/>
     <w:p/>
     <w:p>
       <w:pPr>
         <w:jc w:val="center"/>
+        <w:pBdr>
+          <w:top w:val="single" w:sz="16" w:space="4" w:color="1F497D"/>
+          <w:left w:val="single" w:sz="16" w:space="4" w:color="1F497D"/>
+          <w:bottom w:val="single" w:sz="16" w:space="4" w:color="1F497D"/>
+          <w:right w:val="single" w:sz="16" w:space="4" w:color="1F497D"/>
+        </w:pBdr>
+        <w:shd w:val="clear" w:color="auto" w:fill="1F497D"/>
       </w:pPr>
       <w:r>
-        <w:t>Versión: v1.13  ·  Fecha: 24/08/2026</w:t>
-        <w:br/>
-        <w:t>Ley 21.719 — Protección de Datos Personales de Chile</w:t>
+        <w:rPr>
+          <w:b/>
+          <w:color w:val="FFFFFF"/>
+          <w:sz w:val="20"/>
+        </w:rPr>
+        <w:t xml:space="preserve">  CUMPLIMIENTO DE LA LEY 21.719 DE PROTECCIÓN DE DATOS PERSONALES DE CHILE  </w:t>
       </w:r>
     </w:p>
     <w:p>
@@ -54,25 +266,681 @@
         <w:pStyle w:val="Heading1"/>
       </w:pPr>
       <w:r>
-        <w:t>1. Resumen de Cambios v1.13</w:t>
+        <w:t>Control de versiones</w:t>
       </w:r>
     </w:p>
     <w:tbl>
       <w:tblPr>
         <w:tblStyle w:val="TableGrid"/>
         <w:tblW w:type="auto" w:w="0"/>
+        <w:jc w:val="center"/>
         <w:tblLook w:firstColumn="1" w:firstRow="1" w:lastColumn="0" w:lastRow="0" w:noHBand="0" w:noVBand="1" w:val="04A0"/>
       </w:tblPr>
       <w:tblGrid>
-        <w:gridCol w:w="2880"/>
-        <w:gridCol w:w="2880"/>
-        <w:gridCol w:w="2880"/>
+        <w:gridCol w:w="2493"/>
+        <w:gridCol w:w="2493"/>
+        <w:gridCol w:w="2493"/>
+        <w:gridCol w:w="2493"/>
       </w:tblGrid>
       <w:tr>
         <w:tc>
           <w:tcPr>
-            <w:tcW w:type="dxa" w:w="2880"/>
-            <w:shd w:fill="1F497D" w:color="auto" w:val="clear"/>
+            <w:tcW w:type="dxa" w:w="850"/>
+            <w:shd w:val="clear" w:color="auto" w:fill="1F497D"/>
+          </w:tcPr>
+          <w:p>
+            <w:r/>
+            <w:r>
+              <w:rPr>
+                <w:b/>
+                <w:color w:val="FFFFFF"/>
+              </w:rPr>
+              <w:t>Versión</w:t>
+            </w:r>
+          </w:p>
+        </w:tc>
+        <w:tc>
+          <w:tcPr>
+            <w:tcW w:type="dxa" w:w="1417"/>
+            <w:shd w:val="clear" w:color="auto" w:fill="1F497D"/>
+          </w:tcPr>
+          <w:p>
+            <w:r/>
+            <w:r>
+              <w:rPr>
+                <w:b/>
+                <w:color w:val="FFFFFF"/>
+              </w:rPr>
+              <w:t>Fecha</w:t>
+            </w:r>
+          </w:p>
+        </w:tc>
+        <w:tc>
+          <w:tcPr>
+            <w:tcW w:type="dxa" w:w="1701"/>
+            <w:shd w:val="clear" w:color="auto" w:fill="1F497D"/>
+          </w:tcPr>
+          <w:p>
+            <w:r/>
+            <w:r>
+              <w:rPr>
+                <w:b/>
+                <w:color w:val="FFFFFF"/>
+              </w:rPr>
+              <w:t>Autor</w:t>
+            </w:r>
+          </w:p>
+        </w:tc>
+        <w:tc>
+          <w:tcPr>
+            <w:tcW w:type="dxa" w:w="6004"/>
+            <w:shd w:val="clear" w:color="auto" w:fill="1F497D"/>
+          </w:tcPr>
+          <w:p>
+            <w:r/>
+            <w:r>
+              <w:rPr>
+                <w:b/>
+                <w:color w:val="FFFFFF"/>
+              </w:rPr>
+              <w:t>Cambios</w:t>
+            </w:r>
+          </w:p>
+        </w:tc>
+      </w:tr>
+      <w:tr>
+        <w:tc>
+          <w:tcPr>
+            <w:tcW w:type="dxa" w:w="850"/>
+          </w:tcPr>
+          <w:p>
+            <w:r>
+              <w:rPr>
+                <w:sz w:val="20"/>
+              </w:rPr>
+              <w:t>1.0</w:t>
+            </w:r>
+          </w:p>
+        </w:tc>
+        <w:tc>
+          <w:tcPr>
+            <w:tcW w:type="dxa" w:w="1417"/>
+          </w:tcPr>
+          <w:p>
+            <w:r>
+              <w:rPr>
+                <w:sz w:val="20"/>
+              </w:rPr>
+              <w:t>Junio 2026</w:t>
+            </w:r>
+          </w:p>
+        </w:tc>
+        <w:tc>
+          <w:tcPr>
+            <w:tcW w:type="dxa" w:w="1701"/>
+          </w:tcPr>
+          <w:p>
+            <w:r>
+              <w:rPr>
+                <w:sz w:val="20"/>
+              </w:rPr>
+              <w:t>Equipo de Desarrollo — Custodio</w:t>
+            </w:r>
+          </w:p>
+        </w:tc>
+        <w:tc>
+          <w:tcPr>
+            <w:tcW w:type="dxa" w:w="2493"/>
+          </w:tcPr>
+          <w:p>
+            <w:r/>
+            <w:r>
+              <w:rPr>
+                <w:sz w:val="20"/>
+              </w:rPr>
+              <w:t>Manual técnico inicial: auth, JWT, RBAC, RAT, ARCO.</w:t>
+            </w:r>
+          </w:p>
+        </w:tc>
+      </w:tr>
+      <w:tr>
+        <w:tc>
+          <w:tcPr>
+            <w:tcW w:type="dxa" w:w="850"/>
+          </w:tcPr>
+          <w:p>
+            <w:r>
+              <w:rPr>
+                <w:sz w:val="20"/>
+              </w:rPr>
+              <w:t>1.1</w:t>
+            </w:r>
+          </w:p>
+        </w:tc>
+        <w:tc>
+          <w:tcPr>
+            <w:tcW w:type="dxa" w:w="1417"/>
+          </w:tcPr>
+          <w:p>
+            <w:r>
+              <w:rPr>
+                <w:sz w:val="20"/>
+              </w:rPr>
+              <w:t>Junio 2026</w:t>
+            </w:r>
+          </w:p>
+        </w:tc>
+        <w:tc>
+          <w:tcPr>
+            <w:tcW w:type="dxa" w:w="1701"/>
+          </w:tcPr>
+          <w:p>
+            <w:r>
+              <w:rPr>
+                <w:sz w:val="20"/>
+              </w:rPr>
+              <w:t>Equipo de Desarrollo — Custodio</w:t>
+            </w:r>
+          </w:p>
+        </w:tc>
+        <w:tc>
+          <w:tcPr>
+            <w:tcW w:type="dxa" w:w="2493"/>
+          </w:tcPr>
+          <w:p>
+            <w:r/>
+            <w:r>
+              <w:rPr>
+                <w:sz w:val="20"/>
+              </w:rPr>
+              <w:t>Actualizado con Token blacklist, hash chain, PII masking, CSRF.</w:t>
+            </w:r>
+          </w:p>
+        </w:tc>
+      </w:tr>
+      <w:tr>
+        <w:tc>
+          <w:tcPr>
+            <w:tcW w:type="dxa" w:w="850"/>
+          </w:tcPr>
+          <w:p>
+            <w:r>
+              <w:rPr>
+                <w:sz w:val="20"/>
+              </w:rPr>
+              <w:t>1.2</w:t>
+            </w:r>
+          </w:p>
+        </w:tc>
+        <w:tc>
+          <w:tcPr>
+            <w:tcW w:type="dxa" w:w="1417"/>
+          </w:tcPr>
+          <w:p>
+            <w:r>
+              <w:rPr>
+                <w:sz w:val="20"/>
+              </w:rPr>
+              <w:t>Junio 2026</w:t>
+            </w:r>
+          </w:p>
+        </w:tc>
+        <w:tc>
+          <w:tcPr>
+            <w:tcW w:type="dxa" w:w="1701"/>
+          </w:tcPr>
+          <w:p>
+            <w:r>
+              <w:rPr>
+                <w:sz w:val="20"/>
+              </w:rPr>
+              <w:t>Equipo de Desarrollo — Custodio</w:t>
+            </w:r>
+          </w:p>
+        </w:tc>
+        <w:tc>
+          <w:tcPr>
+            <w:tcW w:type="dxa" w:w="2493"/>
+          </w:tcPr>
+          <w:p>
+            <w:r/>
+            <w:r>
+              <w:rPr>
+                <w:sz w:val="20"/>
+              </w:rPr>
+              <w:t>_Csv injection sanitization, IDOR protection, rate limiting._</w:t>
+            </w:r>
+          </w:p>
+        </w:tc>
+      </w:tr>
+      <w:tr>
+        <w:tc>
+          <w:tcPr>
+            <w:tcW w:type="dxa" w:w="850"/>
+          </w:tcPr>
+          <w:p>
+            <w:r>
+              <w:rPr>
+                <w:sz w:val="20"/>
+              </w:rPr>
+              <w:t>1.3</w:t>
+            </w:r>
+          </w:p>
+        </w:tc>
+        <w:tc>
+          <w:tcPr>
+            <w:tcW w:type="dxa" w:w="1417"/>
+          </w:tcPr>
+          <w:p>
+            <w:r>
+              <w:rPr>
+                <w:sz w:val="20"/>
+              </w:rPr>
+              <w:t>Junio 2026</w:t>
+            </w:r>
+          </w:p>
+        </w:tc>
+        <w:tc>
+          <w:tcPr>
+            <w:tcW w:type="dxa" w:w="1701"/>
+          </w:tcPr>
+          <w:p>
+            <w:r>
+              <w:rPr>
+                <w:sz w:val="20"/>
+              </w:rPr>
+              <w:t>Equipo de Desarrollo — Custodio</w:t>
+            </w:r>
+          </w:p>
+        </w:tc>
+        <w:tc>
+          <w:tcPr>
+            <w:tcW w:type="dxa" w:w="2493"/>
+          </w:tcPr>
+          <w:p>
+            <w:r/>
+            <w:r>
+              <w:rPr>
+                <w:sz w:val="20"/>
+              </w:rPr>
+              <w:t>_Beta Launch: /health, RBAC fixes, Fernet encryption._</w:t>
+            </w:r>
+          </w:p>
+        </w:tc>
+      </w:tr>
+      <w:tr>
+        <w:tc>
+          <w:tcPr>
+            <w:tcW w:type="dxa" w:w="850"/>
+          </w:tcPr>
+          <w:p>
+            <w:r>
+              <w:rPr>
+                <w:sz w:val="20"/>
+              </w:rPr>
+              <w:t>1.4</w:t>
+            </w:r>
+          </w:p>
+        </w:tc>
+        <w:tc>
+          <w:tcPr>
+            <w:tcW w:type="dxa" w:w="1417"/>
+          </w:tcPr>
+          <w:p>
+            <w:r>
+              <w:rPr>
+                <w:sz w:val="20"/>
+              </w:rPr>
+              <w:t>Junio 2026</w:t>
+            </w:r>
+          </w:p>
+        </w:tc>
+        <w:tc>
+          <w:tcPr>
+            <w:tcW w:type="dxa" w:w="1701"/>
+          </w:tcPr>
+          <w:p>
+            <w:r>
+              <w:rPr>
+                <w:sz w:val="20"/>
+              </w:rPr>
+              <w:t>Equipo de Desarrollo — Custodio</w:t>
+            </w:r>
+          </w:p>
+        </w:tc>
+        <w:tc>
+          <w:tcPr>
+            <w:tcW w:type="dxa" w:w="2493"/>
+          </w:tcPr>
+          <w:p>
+            <w:r/>
+            <w:r>
+              <w:rPr>
+                <w:sz w:val="20"/>
+              </w:rPr>
+              <w:t>_OCI Object Storage + Admin Asesor IA._</w:t>
+            </w:r>
+          </w:p>
+        </w:tc>
+      </w:tr>
+      <w:tr>
+        <w:tc>
+          <w:tcPr>
+            <w:tcW w:type="dxa" w:w="850"/>
+          </w:tcPr>
+          <w:p>
+            <w:r>
+              <w:rPr>
+                <w:sz w:val="20"/>
+              </w:rPr>
+              <w:t>1.5</w:t>
+            </w:r>
+          </w:p>
+        </w:tc>
+        <w:tc>
+          <w:tcPr>
+            <w:tcW w:type="dxa" w:w="1417"/>
+          </w:tcPr>
+          <w:p>
+            <w:r>
+              <w:rPr>
+                <w:sz w:val="20"/>
+              </w:rPr>
+              <w:t>Junio 2026</w:t>
+            </w:r>
+          </w:p>
+        </w:tc>
+        <w:tc>
+          <w:tcPr>
+            <w:tcW w:type="dxa" w:w="1701"/>
+          </w:tcPr>
+          <w:p>
+            <w:r>
+              <w:rPr>
+                <w:sz w:val="20"/>
+              </w:rPr>
+              <w:t>Equipo de Desarrollo — Custodio</w:t>
+            </w:r>
+          </w:p>
+        </w:tc>
+        <w:tc>
+          <w:tcPr>
+            <w:tcW w:type="dxa" w:w="2493"/>
+          </w:tcPr>
+          <w:p>
+            <w:r/>
+            <w:r>
+              <w:rPr>
+                <w:sz w:val="20"/>
+              </w:rPr>
+              <w:t>_CSRF middleware, Encryption at Rest Fernet, Service Layer._</w:t>
+            </w:r>
+          </w:p>
+        </w:tc>
+      </w:tr>
+      <w:tr>
+        <w:tc>
+          <w:tcPr>
+            <w:tcW w:type="dxa" w:w="850"/>
+          </w:tcPr>
+          <w:p>
+            <w:r>
+              <w:rPr>
+                <w:sz w:val="20"/>
+              </w:rPr>
+              <w:t>1.6</w:t>
+            </w:r>
+          </w:p>
+        </w:tc>
+        <w:tc>
+          <w:tcPr>
+            <w:tcW w:type="dxa" w:w="1417"/>
+          </w:tcPr>
+          <w:p>
+            <w:r>
+              <w:rPr>
+                <w:sz w:val="20"/>
+              </w:rPr>
+              <w:t>Junio 2026</w:t>
+            </w:r>
+          </w:p>
+        </w:tc>
+        <w:tc>
+          <w:tcPr>
+            <w:tcW w:type="dxa" w:w="1701"/>
+          </w:tcPr>
+          <w:p>
+            <w:r>
+              <w:rPr>
+                <w:sz w:val="20"/>
+              </w:rPr>
+              <w:t>Equipo de Desarrollo — Custodio</w:t>
+            </w:r>
+          </w:p>
+        </w:tc>
+        <w:tc>
+          <w:tcPr>
+            <w:tcW w:type="dxa" w:w="2493"/>
+          </w:tcPr>
+          <w:p>
+            <w:r/>
+            <w:r>
+              <w:rPr>
+                <w:sz w:val="20"/>
+              </w:rPr>
+              <w:t>_UI/UX: RatDetailModal, Drawer responsive, Dashboard clickable._</w:t>
+            </w:r>
+          </w:p>
+        </w:tc>
+      </w:tr>
+      <w:tr>
+        <w:tc>
+          <w:tcPr>
+            <w:tcW w:type="dxa" w:w="850"/>
+          </w:tcPr>
+          <w:p>
+            <w:r>
+              <w:rPr>
+                <w:sz w:val="20"/>
+              </w:rPr>
+              <w:t>1.7</w:t>
+            </w:r>
+          </w:p>
+        </w:tc>
+        <w:tc>
+          <w:tcPr>
+            <w:tcW w:type="dxa" w:w="1417"/>
+          </w:tcPr>
+          <w:p>
+            <w:r>
+              <w:rPr>
+                <w:sz w:val="20"/>
+              </w:rPr>
+              <w:t>Junio 2026</w:t>
+            </w:r>
+          </w:p>
+        </w:tc>
+        <w:tc>
+          <w:tcPr>
+            <w:tcW w:type="dxa" w:w="1701"/>
+          </w:tcPr>
+          <w:p>
+            <w:r>
+              <w:rPr>
+                <w:sz w:val="20"/>
+              </w:rPr>
+              <w:t>Equipo de Desarrollo — Custodio</w:t>
+            </w:r>
+          </w:p>
+        </w:tc>
+        <w:tc>
+          <w:tcPr>
+            <w:tcW w:type="dxa" w:w="2493"/>
+          </w:tcPr>
+          <w:p>
+            <w:r/>
+            <w:r>
+              <w:rPr>
+                <w:sz w:val="20"/>
+              </w:rPr>
+              <w:t>Sprint 1+2: FORMADMIN ARCO, SLA Alert T-2d, Export ARCO CSV/Excel/PDF.</w:t>
+            </w:r>
+          </w:p>
+        </w:tc>
+      </w:tr>
+      <w:tr>
+        <w:tc>
+          <w:tcPr>
+            <w:tcW w:type="dxa" w:w="850"/>
+          </w:tcPr>
+          <w:p>
+            <w:r>
+              <w:rPr>
+                <w:sz w:val="20"/>
+              </w:rPr>
+              <w:t>1.8</w:t>
+            </w:r>
+          </w:p>
+        </w:tc>
+        <w:tc>
+          <w:tcPr>
+            <w:tcW w:type="dxa" w:w="1417"/>
+          </w:tcPr>
+          <w:p>
+            <w:r>
+              <w:rPr>
+                <w:sz w:val="20"/>
+              </w:rPr>
+              <w:t>Junio 2026</w:t>
+            </w:r>
+          </w:p>
+        </w:tc>
+        <w:tc>
+          <w:tcPr>
+            <w:tcW w:type="dxa" w:w="1701"/>
+          </w:tcPr>
+          <w:p>
+            <w:r>
+              <w:rPr>
+                <w:sz w:val="20"/>
+              </w:rPr>
+              <w:t>Equipo de Desarrollo — Custodio</w:t>
+            </w:r>
+          </w:p>
+        </w:tc>
+        <w:tc>
+          <w:tcPr>
+            <w:tcW w:type="dxa" w:w="2493"/>
+          </w:tcPr>
+          <w:p>
+            <w:r/>
+            <w:r>
+              <w:rPr>
+                <w:sz w:val="20"/>
+              </w:rPr>
+              <w:t>_Iter 11+12: BYTEA 10MB limit, Test IL min 50chars, Hash SHA-256 auto ARCO, causal_rechazo enum, notificaciones auto._</w:t>
+            </w:r>
+          </w:p>
+        </w:tc>
+      </w:tr>
+      <w:tr>
+        <w:tc>
+          <w:tcPr>
+            <w:tcW w:type="dxa" w:w="850"/>
+          </w:tcPr>
+          <w:p>
+            <w:r>
+              <w:rPr>
+                <w:sz w:val="20"/>
+              </w:rPr>
+              <w:t>1.9</w:t>
+            </w:r>
+          </w:p>
+        </w:tc>
+        <w:tc>
+          <w:tcPr>
+            <w:tcW w:type="dxa" w:w="1417"/>
+          </w:tcPr>
+          <w:p>
+            <w:r>
+              <w:rPr>
+                <w:sz w:val="20"/>
+              </w:rPr>
+              <w:t>Julio 2026</w:t>
+            </w:r>
+          </w:p>
+        </w:tc>
+        <w:tc>
+          <w:tcPr>
+            <w:tcW w:type="dxa" w:w="1701"/>
+          </w:tcPr>
+          <w:p>
+            <w:r>
+              <w:rPr>
+                <w:sz w:val="20"/>
+              </w:rPr>
+              <w:t>Equipo de Desarrollo — Custodio</w:t>
+            </w:r>
+          </w:p>
+        </w:tc>
+        <w:tc>
+          <w:tcPr>
+            <w:tcW w:type="dxa" w:w="2493"/>
+          </w:tcPr>
+          <w:p>
+            <w:r/>
+            <w:r>
+              <w:rPr>
+                <w:sz w:val="20"/>
+                <w:u w:val="single"/>
+              </w:rPr>
+              <w:t>_IDOR multi-tenant get_rat_for_user() en 6 endpoints RAT. base_legal_valida strict. ConsentimientoAlert. Homologación orden campos RAT. PDF títulos de sección. Encoding UTF-8 fix._</w:t>
+            </w:r>
+          </w:p>
+        </w:tc>
+      </w:tr>
+    </w:tbl>
+    <w:p/>
+    <w:p>
+      <w:pPr>
+        <w:pStyle w:val="Heading2"/>
+      </w:pPr>
+      <w:r>
+        <w:t>Estado del documento</w:t>
+      </w:r>
+    </w:p>
+    <w:tbl>
+      <w:tblPr>
+        <w:tblStyle w:val="TableGrid"/>
+        <w:tblW w:type="auto" w:w="0"/>
+        <w:jc w:val="center"/>
+        <w:tblLook w:firstColumn="1" w:firstRow="1" w:lastColumn="0" w:lastRow="0" w:noHBand="0" w:noVBand="1" w:val="04A0"/>
+      </w:tblPr>
+      <w:tblGrid>
+        <w:gridCol w:w="4986"/>
+        <w:gridCol w:w="4986"/>
+      </w:tblGrid>
+      <w:tr>
+        <w:tc>
+          <w:tcPr>
+            <w:tcW w:type="dxa" w:w="4986"/>
+            <w:shd w:val="clear" w:color="auto" w:fill="1F497D"/>
+          </w:tcPr>
+          <w:p>
+            <w:r/>
+            <w:r>
+              <w:rPr>
+                <w:b/>
+                <w:color w:val="FFFFFF"/>
+              </w:rPr>
+              <w:t>Campo</w:t>
+            </w:r>
+          </w:p>
+        </w:tc>
+        <w:tc>
+          <w:tcPr>
+            <w:tcW w:type="dxa" w:w="4986"/>
+            <w:shd w:val="clear" w:color="auto" w:fill="1F497D"/>
           </w:tcPr>
           <w:p>
             <w:r>
@@ -80,37 +948,7 @@
                 <w:b/>
                 <w:color w:val="FFFFFF"/>
               </w:rPr>
-              <w:t>Componente</w:t>
-            </w:r>
-          </w:p>
-        </w:tc>
-        <w:tc>
-          <w:tcPr>
-            <w:tcW w:type="dxa" w:w="2880"/>
-            <w:shd w:fill="1F497D" w:color="auto" w:val="clear"/>
-          </w:tcPr>
-          <w:p>
-            <w:r>
-              <w:rPr>
-                <w:b/>
-                <w:color w:val="FFFFFF"/>
-              </w:rPr>
-              <w:t>Capa</w:t>
-            </w:r>
-          </w:p>
-        </w:tc>
-        <w:tc>
-          <w:tcPr>
-            <w:tcW w:type="dxa" w:w="2880"/>
-            <w:shd w:fill="1F497D" w:color="auto" w:val="clear"/>
-          </w:tcPr>
-          <w:p>
-            <w:r>
-              <w:rPr>
-                <w:b/>
-                <w:color w:val="FFFFFF"/>
-              </w:rPr>
-              <w:t>Descripción</w:t>
+              <w:t>Valor</w:t>
             </w:r>
           </w:p>
         </w:tc>
@@ -118,31 +956,27 @@
       <w:tr>
         <w:tc>
           <w:tcPr>
-            <w:tcW w:type="dxa" w:w="2880"/>
+            <w:tcW w:type="dxa" w:w="4986"/>
           </w:tcPr>
           <w:p>
             <w:r>
-              <w:t>Público-QW5</w:t>
+              <w:rPr>
+                <w:sz w:val="20"/>
+              </w:rPr>
+              <w:t>Nombre</w:t>
             </w:r>
           </w:p>
         </w:tc>
         <w:tc>
           <w:tcPr>
-            <w:tcW w:type="dxa" w:w="2880"/>
+            <w:tcW w:type="dxa" w:w="4986"/>
           </w:tcPr>
           <w:p>
             <w:r>
-              <w:t>Backend + Frontend</w:t>
-            </w:r>
-          </w:p>
-        </w:tc>
-        <w:tc>
-          <w:tcPr>
-            <w:tcW w:type="dxa" w:w="2880"/>
-          </w:tcPr>
-          <w:p>
-            <w:r>
-              <w:t>GET /publico/verificar-titular: detecta titular con tickets abiertos antes de enviar nueva solicitud ARCO.</w:t>
+              <w:rPr>
+                <w:sz w:val="20"/>
+              </w:rPr>
+              <w:t>Manual Técnico</w:t>
             </w:r>
           </w:p>
         </w:tc>
@@ -150,31 +984,27 @@
       <w:tr>
         <w:tc>
           <w:tcPr>
-            <w:tcW w:type="dxa" w:w="2880"/>
+            <w:tcW w:type="dxa" w:w="4986"/>
           </w:tcPr>
           <w:p>
             <w:r>
-              <w:t>ARCO-QW6</w:t>
+              <w:rPr>
+                <w:sz w:val="20"/>
+              </w:rPr>
+              <w:t>Producto</w:t>
             </w:r>
           </w:p>
         </w:tc>
         <w:tc>
           <w:tcPr>
-            <w:tcW w:type="dxa" w:w="2880"/>
+            <w:tcW w:type="dxa" w:w="4986"/>
           </w:tcPr>
           <w:p>
             <w:r>
-              <w:t>Backend</w:t>
-            </w:r>
-          </w:p>
-        </w:tc>
-        <w:tc>
-          <w:tcPr>
-            <w:tcW w:type="dxa" w:w="2880"/>
-          </w:tcPr>
-          <w:p>
-            <w:r>
-              <w:t>notificar_acuse_solicitud(): email automático al crear ticket ARCO con titular_email.</w:t>
+              <w:rPr>
+                <w:sz w:val="20"/>
+              </w:rPr>
+              <w:t>Custodio RAT Manager</w:t>
             </w:r>
           </w:p>
         </w:tc>
@@ -182,931 +1012,27 @@
       <w:tr>
         <w:tc>
           <w:tcPr>
-            <w:tcW w:type="dxa" w:w="2880"/>
+            <w:tcW w:type="dxa" w:w="4986"/>
           </w:tcPr>
           <w:p>
             <w:r>
-              <w:t>ARCO-QW7</w:t>
+              <w:rPr>
+                <w:sz w:val="20"/>
+              </w:rPr>
+              <w:t>Marco regulatorio</w:t>
             </w:r>
           </w:p>
         </w:tc>
         <w:tc>
           <w:tcPr>
-            <w:tcW w:type="dxa" w:w="2880"/>
-          </w:tcPr>
-          <w:p>
-            <w:r>
-              <w:t>Frontend</w:t>
-            </w:r>
-          </w:p>
-        </w:tc>
-        <w:tc>
-          <w:tcPr>
-            <w:tcW w:type="dxa" w:w="2880"/>
-          </w:tcPr>
-          <w:p>
-            <w:r>
-              <w:t>Chips de placeholders en TicketDrawer.tsx: {{nombre_titular}}, {{empresa}}, {{fecha}}, etc.</w:t>
-            </w:r>
-          </w:p>
-        </w:tc>
-      </w:tr>
-      <w:tr>
-        <w:tc>
-          <w:tcPr>
-            <w:tcW w:type="dxa" w:w="2880"/>
-          </w:tcPr>
-          <w:p>
-            <w:r>
-              <w:t>ARCO-QW8</w:t>
-            </w:r>
-          </w:p>
-        </w:tc>
-        <w:tc>
-          <w:tcPr>
-            <w:tcW w:type="dxa" w:w="2880"/>
-          </w:tcPr>
-          <w:p>
-            <w:r>
-              <w:t>Frontend</w:t>
-            </w:r>
-          </w:p>
-        </w:tc>
-        <w:tc>
-          <w:tcPr>
-            <w:tcW w:type="dxa" w:w="2880"/>
-          </w:tcPr>
-          <w:p>
-            <w:r>
-              <w:t>Banner SLA en FlujoModal.tsx: días hábiles consumidos, días restantes, semáforo de color.</w:t>
-            </w:r>
-          </w:p>
-        </w:tc>
-      </w:tr>
-      <w:tr>
-        <w:tc>
-          <w:tcPr>
-            <w:tcW w:type="dxa" w:w="2880"/>
-          </w:tcPr>
-          <w:p>
-            <w:r>
-              <w:t>Empresas-QW6</w:t>
-            </w:r>
-          </w:p>
-        </w:tc>
-        <w:tc>
-          <w:tcPr>
-            <w:tcW w:type="dxa" w:w="2880"/>
-          </w:tcPr>
-          <w:p>
-            <w:r>
-              <w:t>Frontend</w:t>
-            </w:r>
-          </w:p>
-        </w:tc>
-        <w:tc>
-          <w:tcPr>
-            <w:tcW w:type="dxa" w:w="2880"/>
-          </w:tcPr>
-          <w:p>
-            <w:r>
-              <w:t>CompanyFichaPanel.tsx: panel con 4 tabs (Datos/RATs/ARCO/Brechas) con carga lazy.</w:t>
-            </w:r>
-          </w:p>
-        </w:tc>
-      </w:tr>
-      <w:tr>
-        <w:tc>
-          <w:tcPr>
-            <w:tcW w:type="dxa" w:w="2880"/>
-          </w:tcPr>
-          <w:p>
-            <w:r>
-              <w:t>CI/CD</w:t>
-            </w:r>
-          </w:p>
-        </w:tc>
-        <w:tc>
-          <w:tcPr>
-            <w:tcW w:type="dxa" w:w="2880"/>
-          </w:tcPr>
-          <w:p>
-            <w:r>
-              <w:t>DevOps</w:t>
-            </w:r>
-          </w:p>
-        </w:tc>
-        <w:tc>
-          <w:tcPr>
-            <w:tcW w:type="dxa" w:w="2880"/>
-          </w:tcPr>
-          <w:p>
-            <w:r>
-              <w:t>pip-audit en job lint: bloquea CRITICAL, advierte HIGH. Env vars ALLOWED_ORIGINS y ENVIRONMENT hardcodeados para tests.</w:t>
-            </w:r>
-          </w:p>
-        </w:tc>
-      </w:tr>
-      <w:tr>
-        <w:tc>
-          <w:tcPr>
-            <w:tcW w:type="dxa" w:w="2880"/>
-          </w:tcPr>
-          <w:p>
-            <w:r>
-              <w:t>Nomenclatura</w:t>
-            </w:r>
-          </w:p>
-        </w:tc>
-        <w:tc>
-          <w:tcPr>
-            <w:tcW w:type="dxa" w:w="2880"/>
-          </w:tcPr>
-          <w:p>
-            <w:r>
-              <w:t>Global</w:t>
-            </w:r>
-          </w:p>
-        </w:tc>
-        <w:tc>
-          <w:tcPr>
-            <w:tcW w:type="dxa" w:w="2880"/>
-          </w:tcPr>
-          <w:p>
-            <w:r>
-              <w:t>APDC → APDP (Agencia de Protección de Datos Personales) en código, tests y docs.</w:t>
-            </w:r>
-          </w:p>
-        </w:tc>
-      </w:tr>
-    </w:tbl>
-    <w:p>
-      <w:pPr>
-        <w:pStyle w:val="Heading1"/>
-      </w:pPr>
-      <w:r>
-        <w:t>2. Nuevo Endpoint: GET /publico/verificar-titular</w:t>
-      </w:r>
-    </w:p>
-    <w:p>
-      <w:r>
-        <w:t>Archivo: backend/app/routes/publico_arco.py</w:t>
-      </w:r>
-    </w:p>
-    <w:p>
-      <w:r>
-        <w:t>Endpoint público (sin autenticación) que verifica si un email ya tiene solicitudes ARCO en estado abierto/en_proceso/pendiente_subsanacion para una empresa dada.</w:t>
-        <w:br/>
-        <w:br/>
-        <w:t>Rate limit: 20/minuto por IP (para evitar enumeración de emails).</w:t>
-        <w:br/>
-        <w:t>Respuesta: {tiene_tickets_abiertos: bool, cantidad: int}</w:t>
-      </w:r>
-    </w:p>
-    <w:p>
-      <w:pPr>
-        <w:pStyle w:val="Heading2"/>
-      </w:pPr>
-      <w:r>
-        <w:t>2.1 Seguridad</w:t>
-      </w:r>
-    </w:p>
-    <w:p>
-      <w:r>
-        <w:t>• No revela si el email existe en el sistema (solo indica tickets abiertos en esa empresa).</w:t>
-        <w:br/>
-        <w:t>• Rate limited con slowapi (20/min) para prevenir ataques de enumeración.</w:t>
-        <w:br/>
-        <w:t>• Solo estados activos: abierto, en_proceso, pendiente_subsanacion, pendiente.</w:t>
-        <w:br/>
-        <w:t>• titular_email almacenado como texto plano (String(255)) — no cifrado en tkt_solicitud_derecho.</w:t>
-      </w:r>
-    </w:p>
-    <w:p>
-      <w:pPr>
-        <w:pStyle w:val="Heading1"/>
-      </w:pPr>
-      <w:r>
-        <w:t>3. ARCO-QW6: Acuse de Recibo Automático</w:t>
-      </w:r>
-    </w:p>
-    <w:p>
-      <w:r>
-        <w:t>Archivo: backend/app/routes/tkt_solicitud_derecho.py</w:t>
-      </w:r>
-    </w:p>
-    <w:p>
-      <w:r>
-        <w:t>Al crear un ticket ARCO (POST /tkt-solicitud-derecho/) con titular_email presente, el sistema llama notificar_acuse_solicitud() del email_service. Si falla, registra warning en logs pero no revierte la creación del ticket (no bloquea el flujo).</w:t>
-      </w:r>
-    </w:p>
-    <w:p>
-      <w:pPr>
-        <w:pStyle w:val="Heading1"/>
-      </w:pPr>
-      <w:r>
-        <w:t>4. Empresas-QW6: CompanyFichaPanel</w:t>
-      </w:r>
-    </w:p>
-    <w:p>
-      <w:r>
-        <w:t>Archivo: frontend-next/components/companies/CompanyFichaPanel.tsx</w:t>
-      </w:r>
-    </w:p>
-    <w:p>
-      <w:r>
-        <w:t>Componente de panel con 4 tabs con carga lazy:</w:t>
-        <w:br/>
-        <w:t>• Datos: edición de la empresa (reutiliza CompanyEditForm)</w:t>
-        <w:br/>
-        <w:t>• RATs: listado de RATs de la empresa con completitud</w:t>
-        <w:br/>
-        <w:t>• ARCO: tickets de solicitudes de derecho (usa TktListResponse.tickets)</w:t>
-        <w:br/>
-        <w:t>• Brechas: listado de brechas de seguridad</w:t>
-        <w:br/>
-        <w:br/>
-        <w:t>Se activa con un botón 'Ficha' por tarjeta de empresa en /companies.</w:t>
-      </w:r>
-    </w:p>
-    <w:p>
-      <w:pPr>
-        <w:pStyle w:val="Heading1"/>
-      </w:pPr>
-      <w:r>
-        <w:t>5. CI/CD — Pipeline Tests + Coverage</w:t>
-      </w:r>
-    </w:p>
-    <w:p>
-      <w:r>
-        <w:t>Archivo: .github/workflows/tests.yml</w:t>
-      </w:r>
-    </w:p>
-    <w:tbl>
-      <w:tblPr>
-        <w:tblStyle w:val="TableGrid"/>
-        <w:tblW w:type="auto" w:w="0"/>
-        <w:tblLook w:firstColumn="1" w:firstRow="1" w:lastColumn="0" w:lastRow="0" w:noHBand="0" w:noVBand="1" w:val="04A0"/>
-      </w:tblPr>
-      <w:tblGrid>
-        <w:gridCol w:w="2880"/>
-        <w:gridCol w:w="2880"/>
-        <w:gridCol w:w="2880"/>
-      </w:tblGrid>
-      <w:tr>
-        <w:tc>
-          <w:tcPr>
-            <w:tcW w:type="dxa" w:w="2880"/>
-            <w:shd w:fill="1F497D" w:color="auto" w:val="clear"/>
+            <w:tcW w:type="dxa" w:w="4986"/>
           </w:tcPr>
           <w:p>
             <w:r>
               <w:rPr>
-                <w:b/>
-                <w:color w:val="FFFFFF"/>
+                <w:sz w:val="20"/>
               </w:rPr>
-              <w:t>Cambio</w:t>
-            </w:r>
-          </w:p>
-        </w:tc>
-        <w:tc>
-          <w:tcPr>
-            <w:tcW w:type="dxa" w:w="2880"/>
-            <w:shd w:fill="1F497D" w:color="auto" w:val="clear"/>
-          </w:tcPr>
-          <w:p>
-            <w:r>
-              <w:rPr>
-                <w:b/>
-                <w:color w:val="FFFFFF"/>
-              </w:rPr>
-              <w:t>Job</w:t>
-            </w:r>
-          </w:p>
-        </w:tc>
-        <w:tc>
-          <w:tcPr>
-            <w:tcW w:type="dxa" w:w="2880"/>
-            <w:shd w:fill="1F497D" w:color="auto" w:val="clear"/>
-          </w:tcPr>
-          <w:p>
-            <w:r>
-              <w:rPr>
-                <w:b/>
-                <w:color w:val="FFFFFF"/>
-              </w:rPr>
-              <w:t>Detalle</w:t>
-            </w:r>
-          </w:p>
-        </w:tc>
-      </w:tr>
-      <w:tr>
-        <w:tc>
-          <w:tcPr>
-            <w:tcW w:type="dxa" w:w="2880"/>
-          </w:tcPr>
-          <w:p>
-            <w:r>
-              <w:t>pip-audit</w:t>
-            </w:r>
-          </w:p>
-        </w:tc>
-        <w:tc>
-          <w:tcPr>
-            <w:tcW w:type="dxa" w:w="2880"/>
-          </w:tcPr>
-          <w:p>
-            <w:r>
-              <w:t>lint</w:t>
-            </w:r>
-          </w:p>
-        </w:tc>
-        <w:tc>
-          <w:tcPr>
-            <w:tcW w:type="dxa" w:w="2880"/>
-          </w:tcPr>
-          <w:p>
-            <w:r>
-              <w:t>Escaneo CVE en requirements.txt. CRITICAL bloquea CI; HIGH aparece como warning.</w:t>
-            </w:r>
-          </w:p>
-        </w:tc>
-      </w:tr>
-      <w:tr>
-        <w:tc>
-          <w:tcPr>
-            <w:tcW w:type="dxa" w:w="2880"/>
-          </w:tcPr>
-          <w:p>
-            <w:r>
-              <w:t>ALLOWED_ORIGINS</w:t>
-            </w:r>
-          </w:p>
-        </w:tc>
-        <w:tc>
-          <w:tcPr>
-            <w:tcW w:type="dxa" w:w="2880"/>
-          </w:tcPr>
-          <w:p>
-            <w:r>
-              <w:t>backend-tests</w:t>
-            </w:r>
-          </w:p>
-        </w:tc>
-        <w:tc>
-          <w:tcPr>
-            <w:tcW w:type="dxa" w:w="2880"/>
-          </w:tcPr>
-          <w:p>
-            <w:r>
-              <w:t>Hardcodeado a 'http://localhost:3000' (evita RuntimeError al importar main.py).</w:t>
-            </w:r>
-          </w:p>
-        </w:tc>
-      </w:tr>
-      <w:tr>
-        <w:tc>
-          <w:tcPr>
-            <w:tcW w:type="dxa" w:w="2880"/>
-          </w:tcPr>
-          <w:p>
-            <w:r>
-              <w:t>ENVIRONMENT</w:t>
-            </w:r>
-          </w:p>
-        </w:tc>
-        <w:tc>
-          <w:tcPr>
-            <w:tcW w:type="dxa" w:w="2880"/>
-          </w:tcPr>
-          <w:p>
-            <w:r>
-              <w:t>backend-tests</w:t>
-            </w:r>
-          </w:p>
-        </w:tc>
-        <w:tc>
-          <w:tcPr>
-            <w:tcW w:type="dxa" w:w="2880"/>
-          </w:tcPr>
-          <w:p>
-            <w:r>
-              <w:t>Hardcodeado a 'development' (activa dev fallbacks de crypto y JWT).</w:t>
-            </w:r>
-          </w:p>
-        </w:tc>
-      </w:tr>
-      <w:tr>
-        <w:tc>
-          <w:tcPr>
-            <w:tcW w:type="dxa" w:w="2880"/>
-          </w:tcPr>
-          <w:p>
-            <w:r>
-              <w:t>Verificar secret</w:t>
-            </w:r>
-          </w:p>
-        </w:tc>
-        <w:tc>
-          <w:tcPr>
-            <w:tcW w:type="dxa" w:w="2880"/>
-          </w:tcPr>
-          <w:p>
-            <w:r>
-              <w:t>backend-tests</w:t>
-            </w:r>
-          </w:p>
-        </w:tc>
-        <w:tc>
-          <w:tcPr>
-            <w:tcW w:type="dxa" w:w="2880"/>
-          </w:tcPr>
-          <w:p>
-            <w:r>
-              <w:t>Step previo que falla con mensaje claro si TEST_DATABASE_URL no está configurado.</w:t>
-            </w:r>
-          </w:p>
-        </w:tc>
-      </w:tr>
-      <w:tr>
-        <w:tc>
-          <w:tcPr>
-            <w:tcW w:type="dxa" w:w="2880"/>
-          </w:tcPr>
-          <w:p>
-            <w:r>
-              <w:t>include/exclude vitest</w:t>
-            </w:r>
-          </w:p>
-        </w:tc>
-        <w:tc>
-          <w:tcPr>
-            <w:tcW w:type="dxa" w:w="2880"/>
-          </w:tcPr>
-          <w:p>
-            <w:r>
-              <w:t>frontend-tests</w:t>
-            </w:r>
-          </w:p>
-        </w:tc>
-        <w:tc>
-          <w:tcPr>
-            <w:tcW w:type="dxa" w:w="2880"/>
-          </w:tcPr>
-          <w:p>
-            <w:r>
-              <w:t>Excluye e2e/ para que Playwright no corra dentro de vitest.</w:t>
-            </w:r>
-          </w:p>
-        </w:tc>
-      </w:tr>
-    </w:tbl>
-    <w:p>
-      <w:pPr>
-        <w:pStyle w:val="Heading1"/>
-      </w:pPr>
-      <w:r>
-        <w:t>6. Stack Tecnológico (vigente)</w:t>
-      </w:r>
-    </w:p>
-    <w:tbl>
-      <w:tblPr>
-        <w:tblStyle w:val="TableGrid"/>
-        <w:tblW w:type="auto" w:w="0"/>
-        <w:tblLook w:firstColumn="1" w:firstRow="1" w:lastColumn="0" w:lastRow="0" w:noHBand="0" w:noVBand="1" w:val="04A0"/>
-      </w:tblPr>
-      <w:tblGrid>
-        <w:gridCol w:w="2880"/>
-        <w:gridCol w:w="2880"/>
-        <w:gridCol w:w="2880"/>
-      </w:tblGrid>
-      <w:tr>
-        <w:tc>
-          <w:tcPr>
-            <w:tcW w:type="dxa" w:w="2880"/>
-            <w:shd w:fill="1F497D" w:color="auto" w:val="clear"/>
-          </w:tcPr>
-          <w:p>
-            <w:r>
-              <w:rPr>
-                <w:b/>
-                <w:color w:val="FFFFFF"/>
-              </w:rPr>
-              <w:t>Componente</w:t>
-            </w:r>
-          </w:p>
-        </w:tc>
-        <w:tc>
-          <w:tcPr>
-            <w:tcW w:type="dxa" w:w="2880"/>
-            <w:shd w:fill="1F497D" w:color="auto" w:val="clear"/>
-          </w:tcPr>
-          <w:p>
-            <w:r>
-              <w:rPr>
-                <w:b/>
-                <w:color w:val="FFFFFF"/>
-              </w:rPr>
-              <w:t>Tecnología</w:t>
-            </w:r>
-          </w:p>
-        </w:tc>
-        <w:tc>
-          <w:tcPr>
-            <w:tcW w:type="dxa" w:w="2880"/>
-            <w:shd w:fill="1F497D" w:color="auto" w:val="clear"/>
-          </w:tcPr>
-          <w:p>
-            <w:r>
-              <w:rPr>
-                <w:b/>
-                <w:color w:val="FFFFFF"/>
-              </w:rPr>
-              <w:t>Notas</w:t>
-            </w:r>
-          </w:p>
-        </w:tc>
-      </w:tr>
-      <w:tr>
-        <w:tc>
-          <w:tcPr>
-            <w:tcW w:type="dxa" w:w="2880"/>
-          </w:tcPr>
-          <w:p>
-            <w:r>
-              <w:t>Backend</w:t>
-            </w:r>
-          </w:p>
-        </w:tc>
-        <w:tc>
-          <w:tcPr>
-            <w:tcW w:type="dxa" w:w="2880"/>
-          </w:tcPr>
-          <w:p>
-            <w:r>
-              <w:t>FastAPI 0.115 + Uvicorn</w:t>
-            </w:r>
-          </w:p>
-        </w:tc>
-        <w:tc>
-          <w:tcPr>
-            <w:tcW w:type="dxa" w:w="2880"/>
-          </w:tcPr>
-          <w:p>
-            <w:r>
-              <w:t>Python 3.9+</w:t>
-            </w:r>
-          </w:p>
-        </w:tc>
-      </w:tr>
-      <w:tr>
-        <w:tc>
-          <w:tcPr>
-            <w:tcW w:type="dxa" w:w="2880"/>
-          </w:tcPr>
-          <w:p>
-            <w:r>
-              <w:t>ORM</w:t>
-            </w:r>
-          </w:p>
-        </w:tc>
-        <w:tc>
-          <w:tcPr>
-            <w:tcW w:type="dxa" w:w="2880"/>
-          </w:tcPr>
-          <w:p>
-            <w:r>
-              <w:t>SQLAlchemy 2.0</w:t>
-            </w:r>
-          </w:p>
-        </w:tc>
-        <w:tc>
-          <w:tcPr>
-            <w:tcW w:type="dxa" w:w="2880"/>
-          </w:tcPr>
-          <w:p>
-            <w:r>
-              <w:t>PostgreSQL (Neon)</w:t>
-            </w:r>
-          </w:p>
-        </w:tc>
-      </w:tr>
-      <w:tr>
-        <w:tc>
-          <w:tcPr>
-            <w:tcW w:type="dxa" w:w="2880"/>
-          </w:tcPr>
-          <w:p>
-            <w:r>
-              <w:t>Validación</w:t>
-            </w:r>
-          </w:p>
-        </w:tc>
-        <w:tc>
-          <w:tcPr>
-            <w:tcW w:type="dxa" w:w="2880"/>
-          </w:tcPr>
-          <w:p>
-            <w:r>
-              <w:t>Pydantic 2.10</w:t>
-            </w:r>
-          </w:p>
-        </w:tc>
-        <w:tc>
-          <w:tcPr>
-            <w:tcW w:type="dxa" w:w="2880"/>
-          </w:tcPr>
-          <w:p>
-            <w:r>
-              <w:t>—</w:t>
-            </w:r>
-          </w:p>
-        </w:tc>
-      </w:tr>
-      <w:tr>
-        <w:tc>
-          <w:tcPr>
-            <w:tcW w:type="dxa" w:w="2880"/>
-          </w:tcPr>
-          <w:p>
-            <w:r>
-              <w:t>Auth</w:t>
-            </w:r>
-          </w:p>
-        </w:tc>
-        <w:tc>
-          <w:tcPr>
-            <w:tcW w:type="dxa" w:w="2880"/>
-          </w:tcPr>
-          <w:p>
-            <w:r>
-              <w:t>JWT (HS256) + bcrypt</w:t>
-            </w:r>
-          </w:p>
-        </w:tc>
-        <w:tc>
-          <w:tcPr>
-            <w:tcW w:type="dxa" w:w="2880"/>
-          </w:tcPr>
-          <w:p>
-            <w:r>
-              <w:t>python-jose 3.3.0, passlib 1.7.4</w:t>
-            </w:r>
-          </w:p>
-        </w:tc>
-      </w:tr>
-      <w:tr>
-        <w:tc>
-          <w:tcPr>
-            <w:tcW w:type="dxa" w:w="2880"/>
-          </w:tcPr>
-          <w:p>
-            <w:r>
-              <w:t>Cifrado</w:t>
-            </w:r>
-          </w:p>
-        </w:tc>
-        <w:tc>
-          <w:tcPr>
-            <w:tcW w:type="dxa" w:w="2880"/>
-          </w:tcPr>
-          <w:p>
-            <w:r>
-              <w:t>Fernet (cryptography 43)</w:t>
-            </w:r>
-          </w:p>
-        </w:tc>
-        <w:tc>
-          <w:tcPr>
-            <w:tcW w:type="dxa" w:w="2880"/>
-          </w:tcPr>
-          <w:p>
-            <w:r>
-              <w:t>ENCRYPTION_KEY obligatoria en prod/qa</w:t>
-            </w:r>
-          </w:p>
-        </w:tc>
-      </w:tr>
-      <w:tr>
-        <w:tc>
-          <w:tcPr>
-            <w:tcW w:type="dxa" w:w="2880"/>
-          </w:tcPr>
-          <w:p>
-            <w:r>
-              <w:t>Email</w:t>
-            </w:r>
-          </w:p>
-        </w:tc>
-        <w:tc>
-          <w:tcPr>
-            <w:tcW w:type="dxa" w:w="2880"/>
-          </w:tcPr>
-          <w:p>
-            <w:r>
-              <w:t>SMTP via SMTP_URL DSN</w:t>
-            </w:r>
-          </w:p>
-        </w:tc>
-        <w:tc>
-          <w:tcPr>
-            <w:tcW w:type="dxa" w:w="2880"/>
-          </w:tcPr>
-          <w:p>
-            <w:r>
-              <w:t>Modo DRY_RUN si no configurado</w:t>
-            </w:r>
-          </w:p>
-        </w:tc>
-      </w:tr>
-      <w:tr>
-        <w:tc>
-          <w:tcPr>
-            <w:tcW w:type="dxa" w:w="2880"/>
-          </w:tcPr>
-          <w:p>
-            <w:r>
-              <w:t>Frontend</w:t>
-            </w:r>
-          </w:p>
-        </w:tc>
-        <w:tc>
-          <w:tcPr>
-            <w:tcW w:type="dxa" w:w="2880"/>
-          </w:tcPr>
-          <w:p>
-            <w:r>
-              <w:t>Next.js 16.2 + React 19</w:t>
-            </w:r>
-          </w:p>
-        </w:tc>
-        <w:tc>
-          <w:tcPr>
-            <w:tcW w:type="dxa" w:w="2880"/>
-          </w:tcPr>
-          <w:p>
-            <w:r>
-              <w:t>TypeScript + Tailwind CSS v4</w:t>
-            </w:r>
-          </w:p>
-        </w:tc>
-      </w:tr>
-      <w:tr>
-        <w:tc>
-          <w:tcPr>
-            <w:tcW w:type="dxa" w:w="2880"/>
-          </w:tcPr>
-          <w:p>
-            <w:r>
-              <w:t>Tests backend</w:t>
-            </w:r>
-          </w:p>
-        </w:tc>
-        <w:tc>
-          <w:tcPr>
-            <w:tcW w:type="dxa" w:w="2880"/>
-          </w:tcPr>
-          <w:p>
-            <w:r>
-              <w:t>pytest 8.3 + httpx</w:t>
-            </w:r>
-          </w:p>
-        </w:tc>
-        <w:tc>
-          <w:tcPr>
-            <w:tcW w:type="dxa" w:w="2880"/>
-          </w:tcPr>
-          <w:p>
-            <w:r>
-              <w:t>761+ tests contra Neon QA</w:t>
-            </w:r>
-          </w:p>
-        </w:tc>
-      </w:tr>
-      <w:tr>
-        <w:tc>
-          <w:tcPr>
-            <w:tcW w:type="dxa" w:w="2880"/>
-          </w:tcPr>
-          <w:p>
-            <w:r>
-              <w:t>Tests frontend</w:t>
-            </w:r>
-          </w:p>
-        </w:tc>
-        <w:tc>
-          <w:tcPr>
-            <w:tcW w:type="dxa" w:w="2880"/>
-          </w:tcPr>
-          <w:p>
-            <w:r>
-              <w:t>vitest 3 + Playwright</w:t>
-            </w:r>
-          </w:p>
-        </w:tc>
-        <w:tc>
-          <w:tcPr>
-            <w:tcW w:type="dxa" w:w="2880"/>
-          </w:tcPr>
-          <w:p>
-            <w:r>
-              <w:t>E2E separados del runner vitest</w:t>
-            </w:r>
-          </w:p>
-        </w:tc>
-      </w:tr>
-      <w:tr>
-        <w:tc>
-          <w:tcPr>
-            <w:tcW w:type="dxa" w:w="2880"/>
-          </w:tcPr>
-          <w:p>
-            <w:r>
-              <w:t>CI/CD</w:t>
-            </w:r>
-          </w:p>
-        </w:tc>
-        <w:tc>
-          <w:tcPr>
-            <w:tcW w:type="dxa" w:w="2880"/>
-          </w:tcPr>
-          <w:p>
-            <w:r>
-              <w:t>GitHub Actions</w:t>
-            </w:r>
-          </w:p>
-        </w:tc>
-        <w:tc>
-          <w:tcPr>
-            <w:tcW w:type="dxa" w:w="2880"/>
-          </w:tcPr>
-          <w:p>
-            <w:r>
-              <w:t>3 jobs: backend-tests, frontend-tests, lint (ruff + eslint + pip-audit)</w:t>
-            </w:r>
-          </w:p>
-        </w:tc>
-      </w:tr>
-      <w:tr>
-        <w:tc>
-          <w:tcPr>
-            <w:tcW w:type="dxa" w:w="2880"/>
-          </w:tcPr>
-          <w:p>
-            <w:r>
-              <w:t>Hosting</w:t>
-            </w:r>
-          </w:p>
-        </w:tc>
-        <w:tc>
-          <w:tcPr>
-            <w:tcW w:type="dxa" w:w="2880"/>
-          </w:tcPr>
-          <w:p>
-            <w:r>
-              <w:t>Vercel</w:t>
-            </w:r>
-          </w:p>
-        </w:tc>
-        <w:tc>
-          <w:tcPr>
-            <w:tcW w:type="dxa" w:w="2880"/>
-          </w:tcPr>
-          <w:p>
-            <w:r>
-              <w:t>Node.js 24 (actualizado desde 20)</w:t>
-            </w:r>
-          </w:p>
-        </w:tc>
-      </w:tr>
-      <w:tr>
-        <w:tc>
-          <w:tcPr>
-            <w:tcW w:type="dxa" w:w="2880"/>
-          </w:tcPr>
-          <w:p>
-            <w:r>
-              <w:t>Base de datos</w:t>
-            </w:r>
-          </w:p>
-        </w:tc>
-        <w:tc>
-          <w:tcPr>
-            <w:tcW w:type="dxa" w:w="2880"/>
-          </w:tcPr>
-          <w:p>
-            <w:r>
-              <w:t>Neon PostgreSQL</w:t>
-            </w:r>
-          </w:p>
-        </w:tc>
-        <w:tc>
-          <w:tcPr>
-            <w:tcW w:type="dxa" w:w="2880"/>
-          </w:tcPr>
-          <w:p>
-            <w:r>
-              <w:t>BD prod + BD QA separada para tests</w:t>
+              <w:t>Ley N.° 21.719 de Protección de Datos Personales (Chile)</w:t>
             </w:r>
           </w:p>
         </w:tc>
@@ -1122,242 +1048,2019 @@
         <w:pStyle w:val="Heading1"/>
       </w:pPr>
       <w:r>
-        <w:t>Historial de cambios — v1.13</w:t>
+        <w:t>Tabla de contenido</w:t>
+      </w:r>
+    </w:p>
+    <w:p>
+      <w:r>
+        <w:fldChar w:fldCharType="begin"/>
+        <w:instrText xml:space="preserve">TOC \o "1-3" \h \z \u</w:instrText>
+        <w:fldChar w:fldCharType="separate"/>
+        <w:fldChar w:fldCharType="end"/>
       </w:r>
     </w:p>
     <w:p>
       <w:r>
         <w:rPr>
-          <w:b/>
+          <w:i/>
+          <w:color w:val="808080"/>
+          <w:sz w:val="18"/>
         </w:rPr>
-        <w:t>Versión v1.13 — 2026-09-06</w:t>
+        <w:t>Sugerencia: en Microsoft Word, presione F9 sobre la tabla para actualizar el contenido y los números de página.</w:t>
       </w:r>
     </w:p>
     <w:p>
       <w:r>
-        <w:t>Este documento ha sido actualizado desde v1.12 para reflejar los fixes de seguridad, performance y documentación aplicados en la ronda de auditoría QA de septiembre 2026.</w:t>
+        <w:br w:type="page"/>
       </w:r>
     </w:p>
     <w:p>
       <w:pPr>
-        <w:pStyle w:val="Heading2"/>
+        <w:pStyle w:val="Heading1"/>
       </w:pPr>
       <w:r>
-        <w:t>Cambios incluidos en esta versión</w:t>
+        <w:t>1. Cambios técnicos en v1.10</w:t>
+      </w:r>
+    </w:p>
+    <w:tbl>
+      <w:tblPr>
+        <w:tblStyle w:val="TableGrid"/>
+        <w:tblW w:type="auto" w:w="0"/>
+        <w:jc w:val="left"/>
+        <w:tblLook w:firstColumn="1" w:firstRow="1" w:lastColumn="0" w:lastRow="0" w:noHBand="0" w:noVBand="1" w:val="04A0"/>
+      </w:tblPr>
+      <w:tblGrid>
+        <w:gridCol w:w="2493"/>
+        <w:gridCol w:w="2493"/>
+        <w:gridCol w:w="2493"/>
+        <w:gridCol w:w="2493"/>
+      </w:tblGrid>
+      <w:tr>
+        <w:tc>
+          <w:tcPr>
+            <w:tcW w:type="dxa" w:w="1417"/>
+            <w:shd w:val="clear" w:color="auto" w:fill="D9E2F3"/>
+            <w:vAlign w:val="center"/>
+          </w:tcPr>
+          <w:p>
+            <w:r/>
+            <w:r>
+              <w:rPr>
+                <w:b/>
+                <w:color w:val="1F497D"/>
+                <w:sz w:val="20"/>
+              </w:rPr>
+              <w:t>Cambio</w:t>
+            </w:r>
+          </w:p>
+        </w:tc>
+        <w:tc>
+          <w:tcPr>
+            <w:tcW w:type="dxa" w:w="850"/>
+            <w:shd w:val="clear" w:color="auto" w:fill="D9E2F3"/>
+            <w:vAlign w:val="center"/>
+          </w:tcPr>
+          <w:p>
+            <w:r/>
+            <w:r>
+              <w:rPr>
+                <w:b/>
+                <w:color w:val="1F497D"/>
+                <w:sz w:val="20"/>
+              </w:rPr>
+              <w:t>Severidad</w:t>
+            </w:r>
+          </w:p>
+        </w:tc>
+        <w:tc>
+          <w:tcPr>
+            <w:tcW w:type="dxa" w:w="2835"/>
+            <w:shd w:val="clear" w:color="auto" w:fill="D9E2F3"/>
+            <w:vAlign w:val="center"/>
+          </w:tcPr>
+          <w:p>
+            <w:r/>
+            <w:r>
+              <w:rPr>
+                <w:b/>
+                <w:color w:val="1F497D"/>
+                <w:sz w:val="20"/>
+              </w:rPr>
+              <w:t>Archivos</w:t>
+            </w:r>
+          </w:p>
+        </w:tc>
+        <w:tc>
+          <w:tcPr>
+            <w:tcW w:type="dxa" w:w="5102"/>
+            <w:shd w:val="clear" w:color="auto" w:fill="D9E2F3"/>
+            <w:vAlign w:val="center"/>
+          </w:tcPr>
+          <w:p>
+            <w:r/>
+            <w:r>
+              <w:rPr>
+                <w:b/>
+                <w:color w:val="1F497D"/>
+                <w:sz w:val="20"/>
+              </w:rPr>
+              <w:t>Descripción</w:t>
+            </w:r>
+          </w:p>
+        </w:tc>
+      </w:tr>
+      <w:tr>
+        <w:tc>
+          <w:tcPr>
+            <w:tcW w:type="dxa" w:w="1417"/>
+            <w:vAlign w:val="top"/>
+          </w:tcPr>
+          <w:p>
+            <w:r/>
+            <w:r>
+              <w:rPr>
+                <w:b/>
+                <w:sz w:val="20"/>
+              </w:rPr>
+              <w:t>BYTEA 10MB limit</w:t>
+            </w:r>
+          </w:p>
+        </w:tc>
+        <w:tc>
+          <w:tcPr>
+            <w:tcW w:type="dxa" w:w="850"/>
+            <w:vAlign w:val="top"/>
+          </w:tcPr>
+          <w:p>
+            <w:r/>
+            <w:r>
+              <w:rPr>
+                <w:sz w:val="20"/>
+              </w:rPr>
+              <w:t>CRÍTICO</w:t>
+            </w:r>
+          </w:p>
+        </w:tc>
+        <w:tc>
+          <w:tcPr>
+            <w:tcW w:type="dxa" w:w="2835"/>
+            <w:vAlign w:val="top"/>
+          </w:tcPr>
+          <w:p>
+            <w:r/>
+            <w:r>
+              <w:rPr>
+                <w:sz w:val="20"/>
+              </w:rPr>
+              <w:t>models/rat.py, models/tkt_adjunto.py, migrations/2026_06_26_013_bytea_limit_10mb.sql</w:t>
+            </w:r>
+          </w:p>
+        </w:tc>
+        <w:tc>
+          <w:tcPr>
+            <w:tcW w:type="dxa" w:w="5102"/>
+            <w:vAlign w:val="top"/>
+          </w:tcPr>
+          <w:p>
+            <w:r/>
+            <w:r>
+              <w:rPr>
+                <w:sz w:val="20"/>
+              </w:rPr>
+              <w:t>LargeBinary(10_000_000) en SQLAlchemy. CHECK constraint en PostgreSQL. Aplica a rats.archivo_base_legal_datos y tkt_adjuntos.data.</w:t>
+            </w:r>
+          </w:p>
+        </w:tc>
+      </w:tr>
+      <w:tr>
+        <w:tc>
+          <w:tcPr>
+            <w:tcW w:type="dxa" w:w="1417"/>
+            <w:vAlign w:val="top"/>
+          </w:tcPr>
+          <w:p>
+            <w:r/>
+            <w:r>
+              <w:rPr>
+                <w:b/>
+                <w:sz w:val="20"/>
+              </w:rPr>
+              <w:t>Test IL min 50 chars</w:t>
+            </w:r>
+          </w:p>
+        </w:tc>
+        <w:tc>
+          <w:tcPr>
+            <w:tcW w:type="dxa" w:w="850"/>
+            <w:vAlign w:val="top"/>
+          </w:tcPr>
+          <w:p>
+            <w:r/>
+            <w:r>
+              <w:rPr>
+                <w:sz w:val="20"/>
+              </w:rPr>
+              <w:t>CRÍTICO</w:t>
+            </w:r>
+          </w:p>
+        </w:tc>
+        <w:tc>
+          <w:tcPr>
+            <w:tcW w:type="dxa" w:w="2835"/>
+            <w:vAlign w:val="top"/>
+          </w:tcPr>
+          <w:p>
+            <w:r/>
+            <w:r>
+              <w:rPr>
+                <w:sz w:val="20"/>
+              </w:rPr>
+              <w:t>schemas/rat.py, components/rat/RatWizard.tsx, components/rat/RatEditForm.tsx</w:t>
+            </w:r>
+          </w:p>
+        </w:tc>
+        <w:tc>
+          <w:tcPr>
+            <w:tcW w:type="dxa" w:w="5102"/>
+            <w:vAlign w:val="top"/>
+          </w:tcPr>
+          <w:p>
+            <w:r/>
+            <w:r>
+              <w:rPr>
+                <w:sz w:val="20"/>
+              </w:rPr>
+              <w:t>Pydantic Field(min_length=50). Validación en RatWizard paso 3 y RatEditForm. Toast error si &lt;50 chars.</w:t>
+            </w:r>
+          </w:p>
+        </w:tc>
+      </w:tr>
+      <w:tr>
+        <w:tc>
+          <w:tcPr>
+            <w:tcW w:type="dxa" w:w="1417"/>
+            <w:vAlign w:val="top"/>
+          </w:tcPr>
+          <w:p>
+            <w:r/>
+            <w:r>
+              <w:rPr>
+                <w:b/>
+                <w:sz w:val="20"/>
+              </w:rPr>
+              <w:t>Hash SHA-256 auto ARCO</w:t>
+            </w:r>
+          </w:p>
+        </w:tc>
+        <w:tc>
+          <w:tcPr>
+            <w:tcW w:type="dxa" w:w="850"/>
+            <w:vAlign w:val="top"/>
+          </w:tcPr>
+          <w:p>
+            <w:r/>
+            <w:r>
+              <w:rPr>
+                <w:sz w:val="20"/>
+              </w:rPr>
+              <w:t>CRÍTICO</w:t>
+            </w:r>
+          </w:p>
+        </w:tc>
+        <w:tc>
+          <w:tcPr>
+            <w:tcW w:type="dxa" w:w="2835"/>
+            <w:vAlign w:val="top"/>
+          </w:tcPr>
+          <w:p>
+            <w:r/>
+            <w:r>
+              <w:rPr>
+                <w:sz w:val="20"/>
+              </w:rPr>
+              <w:t>routes/tkt_solicitud_derecho.py (PATCH endpoint)</w:t>
+            </w:r>
+          </w:p>
+        </w:tc>
+        <w:tc>
+          <w:tcPr>
+            <w:tcW w:type="dxa" w:w="5102"/>
+            <w:vAlign w:val="top"/>
+          </w:tcPr>
+          <w:p>
+            <w:r/>
+            <w:r>
+              <w:rPr>
+                <w:sz w:val="20"/>
+              </w:rPr>
+              <w:t>hashlib.sha256() sobre todos los tkt_adjuntos.data en orden. Asignado a evidencia_respuesta_hash al resolver.</w:t>
+            </w:r>
+          </w:p>
+        </w:tc>
+      </w:tr>
+      <w:tr>
+        <w:tc>
+          <w:tcPr>
+            <w:tcW w:type="dxa" w:w="1417"/>
+            <w:vAlign w:val="top"/>
+          </w:tcPr>
+          <w:p>
+            <w:r/>
+            <w:r>
+              <w:rPr>
+                <w:b/>
+                <w:sz w:val="20"/>
+              </w:rPr>
+              <w:t>causal_rechazo enum</w:t>
+            </w:r>
+          </w:p>
+        </w:tc>
+        <w:tc>
+          <w:tcPr>
+            <w:tcW w:type="dxa" w:w="850"/>
+            <w:vAlign w:val="top"/>
+          </w:tcPr>
+          <w:p>
+            <w:r/>
+            <w:r>
+              <w:rPr>
+                <w:sz w:val="20"/>
+              </w:rPr>
+              <w:t>ALTO</w:t>
+            </w:r>
+          </w:p>
+        </w:tc>
+        <w:tc>
+          <w:tcPr>
+            <w:tcW w:type="dxa" w:w="2835"/>
+            <w:vAlign w:val="top"/>
+          </w:tcPr>
+          <w:p>
+            <w:r/>
+            <w:r>
+              <w:rPr>
+                <w:sz w:val="20"/>
+              </w:rPr>
+              <w:t>schemas/tkt_solicitud_derecho.py, models/tkt_solicitud_derecho.py, components/tkt/TicketDrawer.tsx</w:t>
+            </w:r>
+          </w:p>
+        </w:tc>
+        <w:tc>
+          <w:tcPr>
+            <w:tcW w:type="dxa" w:w="5102"/>
+            <w:vAlign w:val="top"/>
+          </w:tcPr>
+          <w:p>
+            <w:r/>
+            <w:r>
+              <w:rPr>
+                <w:sz w:val="20"/>
+              </w:rPr>
+              <w:t>CausalRechazoEnum: 7 valores (Art. 29 RL). Dropdown en TicketDrawer cuando estado=rechazado. Toast error si rechazado sin causal.</w:t>
+            </w:r>
+          </w:p>
+        </w:tc>
+      </w:tr>
+      <w:tr>
+        <w:tc>
+          <w:tcPr>
+            <w:tcW w:type="dxa" w:w="1417"/>
+            <w:vAlign w:val="top"/>
+          </w:tcPr>
+          <w:p>
+            <w:r/>
+            <w:r>
+              <w:rPr>
+                <w:b/>
+                <w:sz w:val="20"/>
+              </w:rPr>
+              <w:t>Toggle ARCO 44px</w:t>
+            </w:r>
+          </w:p>
+        </w:tc>
+        <w:tc>
+          <w:tcPr>
+            <w:tcW w:type="dxa" w:w="850"/>
+            <w:vAlign w:val="top"/>
+          </w:tcPr>
+          <w:p>
+            <w:r/>
+            <w:r>
+              <w:rPr>
+                <w:sz w:val="20"/>
+              </w:rPr>
+              <w:t>ALTO</w:t>
+            </w:r>
+          </w:p>
+        </w:tc>
+        <w:tc>
+          <w:tcPr>
+            <w:tcW w:type="dxa" w:w="2835"/>
+            <w:vAlign w:val="top"/>
+          </w:tcPr>
+          <w:p>
+            <w:r/>
+            <w:r>
+              <w:rPr>
+                <w:sz w:val="20"/>
+              </w:rPr>
+              <w:t>app/solicitud_derecho/page.tsx</w:t>
+            </w:r>
+          </w:p>
+        </w:tc>
+        <w:tc>
+          <w:tcPr>
+            <w:tcW w:type="dxa" w:w="5102"/>
+            <w:vAlign w:val="top"/>
+          </w:tcPr>
+          <w:p>
+            <w:r/>
+            <w:r>
+              <w:rPr>
+                <w:sz w:val="20"/>
+              </w:rPr>
+              <w:t>w-4 h-4 → w-11 h-11. Touch target WCAG 2.1 Level AA para mobile.</w:t>
+            </w:r>
+          </w:p>
+        </w:tc>
+      </w:tr>
+      <w:tr>
+        <w:tc>
+          <w:tcPr>
+            <w:tcW w:type="dxa" w:w="1417"/>
+            <w:vAlign w:val="top"/>
+          </w:tcPr>
+          <w:p>
+            <w:r/>
+            <w:r>
+              <w:rPr>
+                <w:b/>
+                <w:sz w:val="20"/>
+              </w:rPr>
+              <w:t>Notificaciones APDC auto</w:t>
+            </w:r>
+          </w:p>
+        </w:tc>
+        <w:tc>
+          <w:tcPr>
+            <w:tcW w:type="dxa" w:w="850"/>
+            <w:vAlign w:val="top"/>
+          </w:tcPr>
+          <w:p>
+            <w:r/>
+            <w:r>
+              <w:rPr>
+                <w:sz w:val="20"/>
+              </w:rPr>
+              <w:t>ALTO</w:t>
+            </w:r>
+          </w:p>
+        </w:tc>
+        <w:tc>
+          <w:tcPr>
+            <w:tcW w:type="dxa" w:w="2835"/>
+            <w:vAlign w:val="top"/>
+          </w:tcPr>
+          <w:p>
+            <w:r/>
+            <w:r>
+              <w:rPr>
+                <w:sz w:val="20"/>
+              </w:rPr>
+              <w:t>services/breach_service.py (actualizar_brecha)</w:t>
+            </w:r>
+          </w:p>
+        </w:tc>
+        <w:tc>
+          <w:tcPr>
+            <w:tcW w:type="dxa" w:w="5102"/>
+            <w:vAlign w:val="top"/>
+          </w:tcPr>
+          <w:p>
+            <w:r/>
+            <w:r>
+              <w:rPr>
+                <w:sz w:val="20"/>
+              </w:rPr>
+              <w:t>Email al DPO via notificar_nueva_brecha() cuando notificado_apdc=true. DRY_RUN si SMTP no configurado.</w:t>
+            </w:r>
+          </w:p>
+        </w:tc>
+      </w:tr>
+      <w:tr>
+        <w:tc>
+          <w:tcPr>
+            <w:tcW w:type="dxa" w:w="1417"/>
+            <w:vAlign w:val="top"/>
+          </w:tcPr>
+          <w:p>
+            <w:r/>
+            <w:r>
+              <w:rPr>
+                <w:b/>
+                <w:sz w:val="20"/>
+              </w:rPr>
+              <w:t>Notificaciones titulares auto</w:t>
+            </w:r>
+          </w:p>
+        </w:tc>
+        <w:tc>
+          <w:tcPr>
+            <w:tcW w:type="dxa" w:w="850"/>
+            <w:vAlign w:val="top"/>
+          </w:tcPr>
+          <w:p>
+            <w:r/>
+            <w:r>
+              <w:rPr>
+                <w:sz w:val="20"/>
+              </w:rPr>
+              <w:t>ALTO</w:t>
+            </w:r>
+          </w:p>
+        </w:tc>
+        <w:tc>
+          <w:tcPr>
+            <w:tcW w:type="dxa" w:w="2835"/>
+            <w:vAlign w:val="top"/>
+          </w:tcPr>
+          <w:p>
+            <w:r/>
+            <w:r>
+              <w:rPr>
+                <w:sz w:val="20"/>
+              </w:rPr>
+              <w:t>services/breach_service.py (actualizar_brecha)</w:t>
+            </w:r>
+          </w:p>
+        </w:tc>
+        <w:tc>
+          <w:tcPr>
+            <w:tcW w:type="dxa" w:w="5102"/>
+            <w:vAlign w:val="top"/>
+          </w:tcPr>
+          <w:p>
+            <w:r/>
+            <w:r>
+              <w:rPr>
+                <w:sz w:val="20"/>
+              </w:rPr>
+              <w:t>Log.info cuando notificado_titulares=true. Preparado para automatizar por canal (email/SMS/otro).</w:t>
+            </w:r>
+          </w:p>
+        </w:tc>
+      </w:tr>
+    </w:tbl>
+    <w:p>
+      <w:pPr>
+        <w:pStyle w:val="Heading1"/>
+      </w:pPr>
+      <w:r>
+        <w:t>2. Flujo de evidencia ARCO con hash SHA-256</w:t>
       </w:r>
     </w:p>
     <w:p>
       <w:pPr>
-        <w:pStyle w:val="ListBullet"/>
+        <w:pStyle w:val="ListNumber"/>
+        <w:spacing w:after="40"/>
       </w:pPr>
       <w:r>
         <w:rPr>
-          <w:b/>
+          <w:sz w:val="22"/>
         </w:rPr>
-        <w:t xml:space="preserve">Seguridad — RBAC Discovery: </w:t>
-      </w:r>
-      <w:r>
-        <w:t>Endpoints de escritura en /discovery/ (POST sources, PATCH sources, DELETE sources, POST scan, POST scan/manual, PATCH findings/vincular-rat) ahora exigen rol 'editor' o 'admin' per-empresa. Un usuario con rol 'viewer' ya no puede crear fuentes de datos ni ejecutar escaneos.</w:t>
+        <w:t>1. Admin crea/adhiere documentos a ticket TKT vía POST /tkt-solicitud-derecho/{id}/adjuntos</w:t>
       </w:r>
     </w:p>
     <w:p>
       <w:pPr>
-        <w:pStyle w:val="ListBullet"/>
+        <w:pStyle w:val="ListNumber"/>
+        <w:spacing w:after="40"/>
       </w:pPr>
       <w:r>
         <w:rPr>
-          <w:b/>
+          <w:sz w:val="22"/>
         </w:rPr>
-        <w:t xml:space="preserve">Seguridad — RBAC EIPD: </w:t>
-      </w:r>
-      <w:r>
-        <w:t>POST /eipd/ y PUT /eipd/{id} ahora exigen require_editor_or_admin_empresa. Un usuario con rol 'viewer' per-empresa ya no puede crear ni actualizar EIPDs.</w:t>
+        <w:t>2. Admin resuelve ticket: PATCH /tkt-solicitud-derecho/{id} con estado='resuelto'</w:t>
       </w:r>
     </w:p>
     <w:p>
       <w:pPr>
-        <w:pStyle w:val="ListBullet"/>
+        <w:pStyle w:val="ListNumber"/>
+        <w:spacing w:after="40"/>
       </w:pPr>
       <w:r>
         <w:rPr>
-          <w:b/>
+          <w:sz w:val="22"/>
         </w:rPr>
-        <w:t xml:space="preserve">Seguridad — RBAC Contratos de Encargado: </w:t>
-      </w:r>
-      <w:r>
-        <w:t>POST /encargados-contrato/, PUT /encargados-contrato/{id} y DELETE /encargados-contrato/{id} ahora exigen require_editor_or_admin_empresa. 'viewer' ya no puede modificar contratos de encargado.</w:t>
+        <w:t>3. Backend detecta estado=resuelto + ticket.evidencia_respuesta_hash == null</w:t>
       </w:r>
     </w:p>
     <w:p>
       <w:pPr>
-        <w:pStyle w:val="ListBullet"/>
+        <w:pStyle w:val="ListNumber"/>
+        <w:spacing w:after="40"/>
       </w:pPr>
       <w:r>
         <w:rPr>
-          <w:b/>
+          <w:sz w:val="22"/>
         </w:rPr>
-        <w:t xml:space="preserve">Performance — Límites de queries: </w:t>
-      </w:r>
-      <w:r>
-        <w:t>Se agregaron .limit() a queries que podían retornar conjuntos no acotados: get_audit_logs → .limit(500); DiscoveryFinding queries → .limit(5000). Previene timeouts y degradación de memoria ante volúmenes grandes de datos.</w:t>
+        <w:t>4. Backend calcula SHA-256 de todos los tkt_adjuntos.data (en orden por id)</w:t>
       </w:r>
     </w:p>
     <w:p>
       <w:pPr>
-        <w:pStyle w:val="ListBullet"/>
+        <w:pStyle w:val="ListNumber"/>
+        <w:spacing w:after="40"/>
       </w:pPr>
       <w:r>
         <w:rPr>
-          <w:b/>
+          <w:sz w:val="22"/>
         </w:rPr>
-        <w:t xml:space="preserve">Documentación — Discovery: </w:t>
-      </w:r>
-      <w:r>
-        <w:t>Se agregó la sección Discovery &amp; Mapping a CLAUDE.md y a la tabla de endpoints de la API. Se documentó la tabla RBAC por módulo con las reglas canónicas de acceso.</w:t>
+        <w:t>5. Backend asigna sha.hexdigest() a ticket.evidencia_respuesta_hash y guarda en BD</w:t>
       </w:r>
     </w:p>
     <w:p>
       <w:pPr>
-        <w:pStyle w:val="Heading2"/>
+        <w:pStyle w:val="ListNumber"/>
+        <w:spacing w:after="40"/>
       </w:pPr>
       <w:r>
-        <w:t>Cambios de versiones anteriores incorporados</w:t>
+        <w:rPr>
+          <w:sz w:val="22"/>
+        </w:rPr>
+        <w:t>6. Si no hay adjuntos ni respuesta_texto → HTTP 400: 'No se puede resolver sin evidencia'</w:t>
       </w:r>
     </w:p>
     <w:p>
       <w:pPr>
-        <w:pStyle w:val="ListBullet"/>
+        <w:pStyle w:val="ListNumber"/>
+        <w:spacing w:after="40"/>
       </w:pPr>
       <w:r>
         <w:rPr>
-          <w:b/>
+          <w:sz w:val="22"/>
         </w:rPr>
-        <w:t xml:space="preserve">Seguridad — RBAC Brechas: </w:t>
-      </w:r>
-      <w:r>
-        <w:t>PUT /brechas/{id}, DELETE /brechas/{id} y POST /brechas/{id}/evaluar-riesgo bloquean rol 'usuario' global. require_module_enabled('BRECHAS') ahora se aplica también en POST/PUT/DELETE.</w:t>
+        <w:t>7. Respuesta se envía al titular con hash en metadata de auditoría</w:t>
       </w:r>
     </w:p>
     <w:p>
       <w:pPr>
-        <w:pStyle w:val="ListBullet"/>
+        <w:pStyle w:val="Heading1"/>
       </w:pPr>
       <w:r>
-        <w:rPr>
-          <w:b/>
-        </w:rPr>
-        <w:t xml:space="preserve">Seguridad — RBAC Consentimientos: </w:t>
-      </w:r>
-      <w:r>
-        <w:t>POST /consentimientos/ y POST /consentimientos/{id}/revocar bloquean rol 'usuario' global.</w:t>
+        <w:t>3. Límite BYTEA 10MB</w:t>
       </w:r>
     </w:p>
     <w:p>
       <w:pPr>
-        <w:pStyle w:val="ListBullet"/>
+        <w:pStyle w:val="ListNumber"/>
+        <w:spacing w:after="40"/>
       </w:pPr>
       <w:r>
         <w:rPr>
-          <w:b/>
+          <w:sz w:val="22"/>
         </w:rPr>
-        <w:t xml:space="preserve">Seguridad — RBAC TKT Notas: </w:t>
-      </w:r>
-      <w:r>
-        <w:t>POST /tkt-solicitud-derecho/{id}/notas bloquea rol 'usuario' global.</w:t>
+        <w:t>1. Frontend valida tamaño antes de subir (si aplica)</w:t>
       </w:r>
     </w:p>
     <w:p>
       <w:pPr>
-        <w:pStyle w:val="ListBullet"/>
+        <w:pStyle w:val="ListNumber"/>
+        <w:spacing w:after="40"/>
       </w:pPr>
       <w:r>
         <w:rPr>
-          <w:b/>
+          <w:sz w:val="22"/>
         </w:rPr>
-        <w:t xml:space="preserve">Seguridad — IDOR Reglas de Asignación: </w:t>
-      </w:r>
-      <w:r>
-        <w:t>PUT /tkt-reglas-asignacion/{id} validaba acceso a company_id original pero no al company_id destino. Un admin_empresa podía reasignar reglas a empresas de otras compañías. Corregido.</w:t>
+        <w:t>2. SQLAlchemy usa LargeBinary(10_000_000) → PostgreSQL tipo BYTEA sin límite explícito en tipo</w:t>
       </w:r>
     </w:p>
     <w:p>
       <w:pPr>
-        <w:pStyle w:val="ListBullet"/>
+        <w:pStyle w:val="ListNumber"/>
+        <w:spacing w:after="40"/>
       </w:pPr>
       <w:r>
         <w:rPr>
-          <w:b/>
+          <w:sz w:val="22"/>
         </w:rPr>
-        <w:t xml:space="preserve">Seguridad — ARCO Público módulo deshabilitado: </w:t>
-      </w:r>
-      <w:r>
-        <w:t>GET /publico/empresas filtraba por ARCO activo solo en memoria sin query eficiente (N+1). POST /publico/ejercer-derechos no verificaba el módulo ARCO. Ambos corregidos.</w:t>
+        <w:t>3. CHECK constraint added via migración SQL: octet_length(column) &lt;= 10_000_000</w:t>
       </w:r>
     </w:p>
     <w:p>
       <w:pPr>
-        <w:pStyle w:val="ListBullet"/>
+        <w:pStyle w:val="ListNumber"/>
+        <w:spacing w:after="40"/>
       </w:pPr>
       <w:r>
         <w:rPr>
-          <w:b/>
+          <w:sz w:val="22"/>
         </w:rPr>
-        <w:t xml:space="preserve">Seguridad — CSRF token field name: </w:t>
-      </w:r>
-      <w:r>
-        <w:t>getCsrfToken() en frontend/lib/api.ts leía data.csrf_token (indefinido) en vez de data.token. El formulario ARCO público retornaba 403 en cada envío. Corregido.</w:t>
+        <w:t>4. Si se intenta insertar &gt;10MB → PostgreSQL raise_sql constraint violation → rollback</w:t>
       </w:r>
     </w:p>
     <w:p>
       <w:pPr>
-        <w:pStyle w:val="ListBullet"/>
+        <w:pStyle w:val="ListNumber"/>
+        <w:spacing w:after="40"/>
       </w:pPr>
       <w:r>
         <w:rPr>
-          <w:b/>
+          <w:sz w:val="22"/>
         </w:rPr>
-        <w:t xml:space="preserve">Datos — _truthy(False): </w:t>
+        <w:t>5. Error capturado por service layer → HTTP 400 o 500 según contexto</w:t>
       </w:r>
+    </w:p>
+    <w:p/>
+    <w:p>
+      <w:pPr>
+        <w:jc w:val="center"/>
+      </w:pPr>
       <w:r>
-        <w:t>rat_calculations._truthy() no manejaba bool explícitamente; False retornaba True. Campos booleanos con default=False (datos_anonimizados, transferencia_nacional) se contaban como completados. Fix: if isinstance(value, bool): return value.</w:t>
+        <w:rPr>
+          <w:i/>
+          <w:color w:val="808080"/>
+          <w:sz w:val="20"/>
+        </w:rPr>
+        <w:t>—  Fin del documento  —</w:t>
       </w:r>
     </w:p>
     <w:p>
       <w:pPr>
-        <w:pStyle w:val="ListBullet"/>
+        <w:pStyle w:val="Heading1"/>
       </w:pPr>
       <w:r>
-        <w:rPr>
-          <w:b/>
-        </w:rPr>
-        <w:t xml:space="preserve">Datos — evidencia_respuesta_hash: </w:t>
-      </w:r>
-      <w:r>
-        <w:t>El hash de integridad ARCO se computaba antes de aplicar respuesta_texto del PATCH entrante. Si el cliente enviaba estado=resuelto + respuesta_texto en un solo PATCH, el hash quedaba sobre cadena vacía. Fix: usar data.respuesta_texto or ticket.respuesta_texto al momento de hashear.</w:t>
+        <w:t>Cambios técnicos v1.11 (Agosto 2026 — QA Total)</w:t>
       </w:r>
     </w:p>
+    <w:tbl>
+      <w:tblPr>
+        <w:tblStyle w:val="TableGrid"/>
+        <w:tblW w:type="auto" w:w="0"/>
+        <w:tblLook w:firstColumn="1" w:firstRow="1" w:lastColumn="0" w:lastRow="0" w:noHBand="0" w:noVBand="1" w:val="04A0"/>
+      </w:tblPr>
+      <w:tblGrid>
+        <w:gridCol w:w="2493"/>
+        <w:gridCol w:w="2493"/>
+        <w:gridCol w:w="2493"/>
+        <w:gridCol w:w="2493"/>
+      </w:tblGrid>
+      <w:tr>
+        <w:tc>
+          <w:tcPr>
+            <w:tcW w:type="dxa" w:w="1701"/>
+            <w:shd w:val="clear" w:color="auto" w:fill="1F497D"/>
+          </w:tcPr>
+          <w:p>
+            <w:r>
+              <w:rPr>
+                <w:b/>
+                <w:color w:val="FFFFFF"/>
+                <w:sz w:val="18"/>
+              </w:rPr>
+              <w:t>Cambio</w:t>
+            </w:r>
+          </w:p>
+        </w:tc>
+        <w:tc>
+          <w:tcPr>
+            <w:tcW w:type="dxa" w:w="850"/>
+            <w:shd w:val="clear" w:color="auto" w:fill="1F497D"/>
+          </w:tcPr>
+          <w:p>
+            <w:r>
+              <w:rPr>
+                <w:b/>
+                <w:color w:val="FFFFFF"/>
+                <w:sz w:val="18"/>
+              </w:rPr>
+              <w:t>Severidad</w:t>
+            </w:r>
+          </w:p>
+        </w:tc>
+        <w:tc>
+          <w:tcPr>
+            <w:tcW w:type="dxa" w:w="2268"/>
+            <w:shd w:val="clear" w:color="auto" w:fill="1F497D"/>
+          </w:tcPr>
+          <w:p>
+            <w:r>
+              <w:rPr>
+                <w:b/>
+                <w:color w:val="FFFFFF"/>
+                <w:sz w:val="18"/>
+              </w:rPr>
+              <w:t>Archivos</w:t>
+            </w:r>
+          </w:p>
+        </w:tc>
+        <w:tc>
+          <w:tcPr>
+            <w:tcW w:type="dxa" w:w="5386"/>
+            <w:shd w:val="clear" w:color="auto" w:fill="1F497D"/>
+          </w:tcPr>
+          <w:p>
+            <w:r>
+              <w:rPr>
+                <w:b/>
+                <w:color w:val="FFFFFF"/>
+                <w:sz w:val="18"/>
+              </w:rPr>
+              <w:t>Descripción</w:t>
+            </w:r>
+          </w:p>
+        </w:tc>
+      </w:tr>
+      <w:tr>
+        <w:tc>
+          <w:tcPr>
+            <w:tcW w:type="dxa" w:w="1701"/>
+          </w:tcPr>
+          <w:p>
+            <w:r>
+              <w:rPr>
+                <w:sz w:val="18"/>
+              </w:rPr>
+              <w:t>POST /auth/users → 201</w:t>
+            </w:r>
+          </w:p>
+        </w:tc>
+        <w:tc>
+          <w:tcPr>
+            <w:tcW w:type="dxa" w:w="850"/>
+          </w:tcPr>
+          <w:p>
+            <w:r>
+              <w:rPr>
+                <w:sz w:val="18"/>
+              </w:rPr>
+              <w:t>ALTO</w:t>
+            </w:r>
+          </w:p>
+        </w:tc>
+        <w:tc>
+          <w:tcPr>
+            <w:tcW w:type="dxa" w:w="2268"/>
+          </w:tcPr>
+          <w:p>
+            <w:r>
+              <w:rPr>
+                <w:sz w:val="18"/>
+              </w:rPr>
+              <w:t>routes/auth.py:129</w:t>
+            </w:r>
+          </w:p>
+        </w:tc>
+        <w:tc>
+          <w:tcPr>
+            <w:tcW w:type="dxa" w:w="5386"/>
+          </w:tcPr>
+          <w:p>
+            <w:r>
+              <w:rPr>
+                <w:sz w:val="18"/>
+              </w:rPr>
+              <w:t>Agregado status_code=201. Antes retornaba 200 por default FastAPI.</w:t>
+            </w:r>
+          </w:p>
+        </w:tc>
+      </w:tr>
+      <w:tr>
+        <w:tc>
+          <w:tcPr>
+            <w:tcW w:type="dxa" w:w="1701"/>
+          </w:tcPr>
+          <w:p>
+            <w:r>
+              <w:rPr>
+                <w:sz w:val="18"/>
+              </w:rPr>
+              <w:t>PATCH TKT: metodo_verificacion en body</w:t>
+            </w:r>
+          </w:p>
+        </w:tc>
+        <w:tc>
+          <w:tcPr>
+            <w:tcW w:type="dxa" w:w="850"/>
+          </w:tcPr>
+          <w:p>
+            <w:r>
+              <w:rPr>
+                <w:sz w:val="18"/>
+              </w:rPr>
+              <w:t>ALTO</w:t>
+            </w:r>
+          </w:p>
+        </w:tc>
+        <w:tc>
+          <w:tcPr>
+            <w:tcW w:type="dxa" w:w="2268"/>
+          </w:tcPr>
+          <w:p>
+            <w:r>
+              <w:rPr>
+                <w:sz w:val="18"/>
+              </w:rPr>
+              <w:t>routes/tkt_solicitud_derecho.py</w:t>
+            </w:r>
+          </w:p>
+        </w:tc>
+        <w:tc>
+          <w:tcPr>
+            <w:tcW w:type="dxa" w:w="5386"/>
+          </w:tcPr>
+          <w:p>
+            <w:r>
+              <w:rPr>
+                <w:sz w:val="18"/>
+              </w:rPr>
+              <w:t>Condición corregida: verifica campo BD Y body del PATCH. Antes ignoraba el body.</w:t>
+            </w:r>
+          </w:p>
+        </w:tc>
+      </w:tr>
+      <w:tr>
+        <w:tc>
+          <w:tcPr>
+            <w:tcW w:type="dxa" w:w="1701"/>
+          </w:tcPr>
+          <w:p>
+            <w:r>
+              <w:rPr>
+                <w:sz w:val="18"/>
+              </w:rPr>
+              <w:t>encrypt_existing_bytea: ENCRYPTION_KEY estricta</w:t>
+            </w:r>
+          </w:p>
+        </w:tc>
+        <w:tc>
+          <w:tcPr>
+            <w:tcW w:type="dxa" w:w="850"/>
+          </w:tcPr>
+          <w:p>
+            <w:r>
+              <w:rPr>
+                <w:sz w:val="18"/>
+              </w:rPr>
+              <w:t>MEDIO</w:t>
+            </w:r>
+          </w:p>
+        </w:tc>
+        <w:tc>
+          <w:tcPr>
+            <w:tcW w:type="dxa" w:w="2268"/>
+          </w:tcPr>
+          <w:p>
+            <w:r>
+              <w:rPr>
+                <w:sz w:val="18"/>
+              </w:rPr>
+              <w:t>scripts/migration/encrypt_existing_bytea.py</w:t>
+            </w:r>
+          </w:p>
+        </w:tc>
+        <w:tc>
+          <w:tcPr>
+            <w:tcW w:type="dxa" w:w="5386"/>
+          </w:tcPr>
+          <w:p>
+            <w:r>
+              <w:rPr>
+                <w:sz w:val="18"/>
+              </w:rPr>
+              <w:t>Eliminado fallback a settings.ENCRYPTION_KEY. Exige key explícita en entorno.</w:t>
+            </w:r>
+          </w:p>
+        </w:tc>
+      </w:tr>
+      <w:tr>
+        <w:tc>
+          <w:tcPr>
+            <w:tcW w:type="dxa" w:w="1701"/>
+          </w:tcPr>
+          <w:p>
+            <w:r>
+              <w:rPr>
+                <w:sz w:val="18"/>
+              </w:rPr>
+              <w:t>Sprint A: soft delete RAT (Art. 19)</w:t>
+            </w:r>
+          </w:p>
+        </w:tc>
+        <w:tc>
+          <w:tcPr>
+            <w:tcW w:type="dxa" w:w="850"/>
+          </w:tcPr>
+          <w:p>
+            <w:r>
+              <w:rPr>
+                <w:sz w:val="18"/>
+              </w:rPr>
+              <w:t>ALTO</w:t>
+            </w:r>
+          </w:p>
+        </w:tc>
+        <w:tc>
+          <w:tcPr>
+            <w:tcW w:type="dxa" w:w="2268"/>
+          </w:tcPr>
+          <w:p>
+            <w:r>
+              <w:rPr>
+                <w:sz w:val="18"/>
+              </w:rPr>
+              <w:t>services/rat_crud.py, routes/rats.py</w:t>
+            </w:r>
+          </w:p>
+        </w:tc>
+        <w:tc>
+          <w:tcPr>
+            <w:tcW w:type="dxa" w:w="5386"/>
+          </w:tcPr>
+          <w:p>
+            <w:r>
+              <w:rPr>
+                <w:sz w:val="18"/>
+              </w:rPr>
+              <w:t>delete_rat() asigna deleted_at. Filtros excluyen deleted_at IS NOT NULL. RATs aprobados no eliminables (409).</w:t>
+            </w:r>
+          </w:p>
+        </w:tc>
+      </w:tr>
+      <w:tr>
+        <w:tc>
+          <w:tcPr>
+            <w:tcW w:type="dxa" w:w="1701"/>
+          </w:tcPr>
+          <w:p>
+            <w:r>
+              <w:rPr>
+                <w:sz w:val="18"/>
+              </w:rPr>
+              <w:t>Sprint A: EIPD gate aprobación (Art. 15 bis)</w:t>
+            </w:r>
+          </w:p>
+        </w:tc>
+        <w:tc>
+          <w:tcPr>
+            <w:tcW w:type="dxa" w:w="850"/>
+          </w:tcPr>
+          <w:p>
+            <w:r>
+              <w:rPr>
+                <w:sz w:val="18"/>
+              </w:rPr>
+              <w:t>ALTO</w:t>
+            </w:r>
+          </w:p>
+        </w:tc>
+        <w:tc>
+          <w:tcPr>
+            <w:tcW w:type="dxa" w:w="2268"/>
+          </w:tcPr>
+          <w:p>
+            <w:r>
+              <w:rPr>
+                <w:sz w:val="18"/>
+              </w:rPr>
+              <w:t>services/rat_crud.py (aprobar_rat)</w:t>
+            </w:r>
+          </w:p>
+        </w:tc>
+        <w:tc>
+          <w:tcPr>
+            <w:tcW w:type="dxa" w:w="5386"/>
+          </w:tcPr>
+          <w:p>
+            <w:r>
+              <w:rPr>
+                <w:sz w:val="18"/>
+              </w:rPr>
+              <w:t>validar_eipd_obligatoria() bloquea APROBADO sin EIPD cuando datos_sensibles=True o transferencia_int=True.</w:t>
+            </w:r>
+          </w:p>
+        </w:tc>
+      </w:tr>
+      <w:tr>
+        <w:tc>
+          <w:tcPr>
+            <w:tcW w:type="dxa" w:w="1701"/>
+          </w:tcPr>
+          <w:p>
+            <w:r>
+              <w:rPr>
+                <w:sz w:val="18"/>
+              </w:rPr>
+              <w:t>Sprint A: datos NNA (Art. 16 §4)</w:t>
+            </w:r>
+          </w:p>
+        </w:tc>
+        <w:tc>
+          <w:tcPr>
+            <w:tcW w:type="dxa" w:w="850"/>
+          </w:tcPr>
+          <w:p>
+            <w:r>
+              <w:rPr>
+                <w:sz w:val="18"/>
+              </w:rPr>
+              <w:t>ALTO</w:t>
+            </w:r>
+          </w:p>
+        </w:tc>
+        <w:tc>
+          <w:tcPr>
+            <w:tcW w:type="dxa" w:w="2268"/>
+          </w:tcPr>
+          <w:p>
+            <w:r>
+              <w:rPr>
+                <w:sz w:val="18"/>
+              </w:rPr>
+              <w:t>models/rat.py, schemas/rat.py</w:t>
+            </w:r>
+          </w:p>
+        </w:tc>
+        <w:tc>
+          <w:tcPr>
+            <w:tcW w:type="dxa" w:w="5386"/>
+          </w:tcPr>
+          <w:p>
+            <w:r>
+              <w:rPr>
+                <w:sz w:val="18"/>
+              </w:rPr>
+              <w:t>Campo datos_nna boolean. Bloqueo aprobación si datos_nna=True sin EIPD.</w:t>
+            </w:r>
+          </w:p>
+        </w:tc>
+      </w:tr>
+      <w:tr>
+        <w:tc>
+          <w:tcPr>
+            <w:tcW w:type="dxa" w:w="1701"/>
+          </w:tcPr>
+          <w:p>
+            <w:r>
+              <w:rPr>
+                <w:sz w:val="18"/>
+              </w:rPr>
+              <w:t>Sprint A: mutex anon/seudo</w:t>
+            </w:r>
+          </w:p>
+        </w:tc>
+        <w:tc>
+          <w:tcPr>
+            <w:tcW w:type="dxa" w:w="850"/>
+          </w:tcPr>
+          <w:p>
+            <w:r>
+              <w:rPr>
+                <w:sz w:val="18"/>
+              </w:rPr>
+              <w:t>MEDIO</w:t>
+            </w:r>
+          </w:p>
+        </w:tc>
+        <w:tc>
+          <w:tcPr>
+            <w:tcW w:type="dxa" w:w="2268"/>
+          </w:tcPr>
+          <w:p>
+            <w:r>
+              <w:rPr>
+                <w:sz w:val="18"/>
+              </w:rPr>
+              <w:t>schemas/rat.py</w:t>
+            </w:r>
+          </w:p>
+        </w:tc>
+        <w:tc>
+          <w:tcPr>
+            <w:tcW w:type="dxa" w:w="5386"/>
+          </w:tcPr>
+          <w:p>
+            <w:r>
+              <w:rPr>
+                <w:sz w:val="18"/>
+              </w:rPr>
+              <w:t>No se puede marcar datos_anonimizados=True y datos_seudonimizados=True simultáneamente (validator Pydantic).</w:t>
+            </w:r>
+          </w:p>
+        </w:tc>
+      </w:tr>
+      <w:tr>
+        <w:tc>
+          <w:tcPr>
+            <w:tcW w:type="dxa" w:w="1701"/>
+          </w:tcPr>
+          <w:p>
+            <w:r>
+              <w:rPr>
+                <w:sz w:val="18"/>
+              </w:rPr>
+              <w:t>Sprint B: respuesta_texto obligatoria (Art. 12)</w:t>
+            </w:r>
+          </w:p>
+        </w:tc>
+        <w:tc>
+          <w:tcPr>
+            <w:tcW w:type="dxa" w:w="850"/>
+          </w:tcPr>
+          <w:p>
+            <w:r>
+              <w:rPr>
+                <w:sz w:val="18"/>
+              </w:rPr>
+              <w:t>ALTO</w:t>
+            </w:r>
+          </w:p>
+        </w:tc>
+        <w:tc>
+          <w:tcPr>
+            <w:tcW w:type="dxa" w:w="2268"/>
+          </w:tcPr>
+          <w:p>
+            <w:r>
+              <w:rPr>
+                <w:sz w:val="18"/>
+              </w:rPr>
+              <w:t>services/ticket_service.py</w:t>
+            </w:r>
+          </w:p>
+        </w:tc>
+        <w:tc>
+          <w:tcPr>
+            <w:tcW w:type="dxa" w:w="5386"/>
+          </w:tcPr>
+          <w:p>
+            <w:r>
+              <w:rPr>
+                <w:sz w:val="18"/>
+              </w:rPr>
+              <w:t>Bloquea PATCH→resuelto sin respuesta_texto no vacía.</w:t>
+            </w:r>
+          </w:p>
+        </w:tc>
+      </w:tr>
+      <w:tr>
+        <w:tc>
+          <w:tcPr>
+            <w:tcW w:type="dxa" w:w="1701"/>
+          </w:tcPr>
+          <w:p>
+            <w:r>
+              <w:rPr>
+                <w:sz w:val="18"/>
+              </w:rPr>
+              <w:t>Sprint B: SLA alerts 72h brechas</w:t>
+            </w:r>
+          </w:p>
+        </w:tc>
+        <w:tc>
+          <w:tcPr>
+            <w:tcW w:type="dxa" w:w="850"/>
+          </w:tcPr>
+          <w:p>
+            <w:r>
+              <w:rPr>
+                <w:sz w:val="18"/>
+              </w:rPr>
+              <w:t>ALTO</w:t>
+            </w:r>
+          </w:p>
+        </w:tc>
+        <w:tc>
+          <w:tcPr>
+            <w:tcW w:type="dxa" w:w="2268"/>
+          </w:tcPr>
+          <w:p>
+            <w:r>
+              <w:rPr>
+                <w:sz w:val="18"/>
+              </w:rPr>
+              <w:t>services/breach_service.py</w:t>
+            </w:r>
+          </w:p>
+        </w:tc>
+        <w:tc>
+          <w:tcPr>
+            <w:tcW w:type="dxa" w:w="5386"/>
+          </w:tcPr>
+          <w:p>
+            <w:r>
+              <w:rPr>
+                <w:sz w:val="18"/>
+              </w:rPr>
+              <w:t>Alerta automática APDC si brecha sin notificación tras 72h (Art. 14 bis §3).</w:t>
+            </w:r>
+          </w:p>
+        </w:tc>
+      </w:tr>
+      <w:tr>
+        <w:tc>
+          <w:tcPr>
+            <w:tcW w:type="dxa" w:w="1701"/>
+          </w:tcPr>
+          <w:p>
+            <w:r>
+              <w:rPr>
+                <w:sz w:val="18"/>
+              </w:rPr>
+              <w:t>Sprint UX: política transparencia editable (Art. 14 ter)</w:t>
+            </w:r>
+          </w:p>
+        </w:tc>
+        <w:tc>
+          <w:tcPr>
+            <w:tcW w:type="dxa" w:w="850"/>
+          </w:tcPr>
+          <w:p>
+            <w:r>
+              <w:rPr>
+                <w:sz w:val="18"/>
+              </w:rPr>
+              <w:t>MEDIO</w:t>
+            </w:r>
+          </w:p>
+        </w:tc>
+        <w:tc>
+          <w:tcPr>
+            <w:tcW w:type="dxa" w:w="2268"/>
+          </w:tcPr>
+          <w:p>
+            <w:r>
+              <w:rPr>
+                <w:sz w:val="18"/>
+              </w:rPr>
+              <w:t>routes/transparencia.py</w:t>
+            </w:r>
+          </w:p>
+        </w:tc>
+        <w:tc>
+          <w:tcPr>
+            <w:tcW w:type="dxa" w:w="5386"/>
+          </w:tcPr>
+          <w:p>
+            <w:r>
+              <w:rPr>
+                <w:sz w:val="18"/>
+              </w:rPr>
+              <w:t>PUT /transparencia/{company_id} con overrides_json. Hash SHA-256 recalculado en cada guardado.</w:t>
+            </w:r>
+          </w:p>
+        </w:tc>
+      </w:tr>
+    </w:tbl>
     <w:p>
       <w:pPr>
-        <w:pStyle w:val="ListBullet"/>
+        <w:pStyle w:val="Heading1"/>
       </w:pPr>
       <w:r>
-        <w:rPr>
-          <w:b/>
-        </w:rPr>
-        <w:t xml:space="preserve">API — GET /eipd/{id} faltante: </w:t>
-      </w:r>
-      <w:r>
-        <w:t>El servicio tenía get_eipd_by_id() pero no existía la ruta GET. Retornaba 405. Agregada con IDOR check.</w:t>
+        <w:t>Cambios técnicos v1.12 (Septiembre 2026)</w:t>
       </w:r>
     </w:p>
+    <w:tbl>
+      <w:tblPr>
+        <w:tblStyle w:val="TableGrid"/>
+        <w:tblW w:type="auto" w:w="0"/>
+        <w:tblLook w:firstColumn="1" w:firstRow="1" w:lastColumn="0" w:lastRow="0" w:noHBand="0" w:noVBand="1" w:val="04A0"/>
+      </w:tblPr>
+      <w:tblGrid>
+        <w:gridCol w:w="2493"/>
+        <w:gridCol w:w="2493"/>
+        <w:gridCol w:w="2493"/>
+        <w:gridCol w:w="2493"/>
+      </w:tblGrid>
+      <w:tr>
+        <w:tc>
+          <w:tcPr>
+            <w:tcW w:type="dxa" w:w="1701"/>
+            <w:shd w:val="clear" w:color="auto" w:fill="1F497D"/>
+          </w:tcPr>
+          <w:p>
+            <w:r>
+              <w:rPr>
+                <w:b/>
+                <w:color w:val="FFFFFF"/>
+                <w:sz w:val="18"/>
+              </w:rPr>
+              <w:t>Cambio</w:t>
+            </w:r>
+          </w:p>
+        </w:tc>
+        <w:tc>
+          <w:tcPr>
+            <w:tcW w:type="dxa" w:w="850"/>
+            <w:shd w:val="clear" w:color="auto" w:fill="1F497D"/>
+          </w:tcPr>
+          <w:p>
+            <w:r>
+              <w:rPr>
+                <w:b/>
+                <w:color w:val="FFFFFF"/>
+                <w:sz w:val="18"/>
+              </w:rPr>
+              <w:t>Severidad</w:t>
+            </w:r>
+          </w:p>
+        </w:tc>
+        <w:tc>
+          <w:tcPr>
+            <w:tcW w:type="dxa" w:w="2268"/>
+            <w:shd w:val="clear" w:color="auto" w:fill="1F497D"/>
+          </w:tcPr>
+          <w:p>
+            <w:r>
+              <w:rPr>
+                <w:b/>
+                <w:color w:val="FFFFFF"/>
+                <w:sz w:val="18"/>
+              </w:rPr>
+              <w:t>Archivos</w:t>
+            </w:r>
+          </w:p>
+        </w:tc>
+        <w:tc>
+          <w:tcPr>
+            <w:tcW w:type="dxa" w:w="5386"/>
+            <w:shd w:val="clear" w:color="auto" w:fill="1F497D"/>
+          </w:tcPr>
+          <w:p>
+            <w:r>
+              <w:rPr>
+                <w:b/>
+                <w:color w:val="FFFFFF"/>
+                <w:sz w:val="18"/>
+              </w:rPr>
+              <w:t>Descripción</w:t>
+            </w:r>
+          </w:p>
+        </w:tc>
+      </w:tr>
+      <w:tr>
+        <w:tc>
+          <w:tcPr>
+            <w:tcW w:type="dxa" w:w="1701"/>
+          </w:tcPr>
+          <w:p>
+            <w:r>
+              <w:rPr>
+                <w:sz w:val="18"/>
+              </w:rPr>
+              <w:t>Público-QW5: verificar-titular</w:t>
+            </w:r>
+          </w:p>
+        </w:tc>
+        <w:tc>
+          <w:tcPr>
+            <w:tcW w:type="dxa" w:w="850"/>
+          </w:tcPr>
+          <w:p>
+            <w:r>
+              <w:rPr>
+                <w:sz w:val="18"/>
+              </w:rPr>
+              <w:t>MEDIO</w:t>
+            </w:r>
+          </w:p>
+        </w:tc>
+        <w:tc>
+          <w:tcPr>
+            <w:tcW w:type="dxa" w:w="2268"/>
+          </w:tcPr>
+          <w:p>
+            <w:r>
+              <w:rPr>
+                <w:sz w:val="18"/>
+              </w:rPr>
+              <w:t>routes/publico_arco.py</w:t>
+            </w:r>
+          </w:p>
+        </w:tc>
+        <w:tc>
+          <w:tcPr>
+            <w:tcW w:type="dxa" w:w="5386"/>
+          </w:tcPr>
+          <w:p>
+            <w:r>
+              <w:rPr>
+                <w:sz w:val="18"/>
+              </w:rPr>
+              <w:t>GET /publico/verificar-titular. Rate 20/min. Detecta si email ya tiene TKTs abiertos sin revelar si el email existe (solo indica estado abierto en esa empresa).</w:t>
+            </w:r>
+          </w:p>
+        </w:tc>
+      </w:tr>
+      <w:tr>
+        <w:tc>
+          <w:tcPr>
+            <w:tcW w:type="dxa" w:w="1701"/>
+          </w:tcPr>
+          <w:p>
+            <w:r>
+              <w:rPr>
+                <w:sz w:val="18"/>
+              </w:rPr>
+              <w:t>ARCO-QW6: acuse de recibo automático</w:t>
+            </w:r>
+          </w:p>
+        </w:tc>
+        <w:tc>
+          <w:tcPr>
+            <w:tcW w:type="dxa" w:w="850"/>
+          </w:tcPr>
+          <w:p>
+            <w:r>
+              <w:rPr>
+                <w:sz w:val="18"/>
+              </w:rPr>
+              <w:t>ALTO</w:t>
+            </w:r>
+          </w:p>
+        </w:tc>
+        <w:tc>
+          <w:tcPr>
+            <w:tcW w:type="dxa" w:w="2268"/>
+          </w:tcPr>
+          <w:p>
+            <w:r>
+              <w:rPr>
+                <w:sz w:val="18"/>
+              </w:rPr>
+              <w:t>routes/tkt_solicitud_derecho.py, services/email_service.py</w:t>
+            </w:r>
+          </w:p>
+        </w:tc>
+        <w:tc>
+          <w:tcPr>
+            <w:tcW w:type="dxa" w:w="5386"/>
+          </w:tcPr>
+          <w:p>
+            <w:r>
+              <w:rPr>
+                <w:sz w:val="18"/>
+              </w:rPr>
+              <w:t>notificar_acuse_solicitud() al crear TKT con titular_email. Fallo registra warning, no revierte.</w:t>
+            </w:r>
+          </w:p>
+        </w:tc>
+      </w:tr>
+      <w:tr>
+        <w:tc>
+          <w:tcPr>
+            <w:tcW w:type="dxa" w:w="1701"/>
+          </w:tcPr>
+          <w:p>
+            <w:r>
+              <w:rPr>
+                <w:sz w:val="18"/>
+              </w:rPr>
+              <w:t>ARCO-QW7: chips de placeholders</w:t>
+            </w:r>
+          </w:p>
+        </w:tc>
+        <w:tc>
+          <w:tcPr>
+            <w:tcW w:type="dxa" w:w="850"/>
+          </w:tcPr>
+          <w:p>
+            <w:r>
+              <w:rPr>
+                <w:sz w:val="18"/>
+              </w:rPr>
+              <w:t>MEDIO</w:t>
+            </w:r>
+          </w:p>
+        </w:tc>
+        <w:tc>
+          <w:tcPr>
+            <w:tcW w:type="dxa" w:w="2268"/>
+          </w:tcPr>
+          <w:p>
+            <w:r>
+              <w:rPr>
+                <w:sz w:val="18"/>
+              </w:rPr>
+              <w:t>frontend-next/components/tkt/TicketDrawer.tsx</w:t>
+            </w:r>
+          </w:p>
+        </w:tc>
+        <w:tc>
+          <w:tcPr>
+            <w:tcW w:type="dxa" w:w="5386"/>
+          </w:tcPr>
+          <w:p>
+            <w:r>
+              <w:rPr>
+                <w:sz w:val="18"/>
+              </w:rPr>
+              <w:t>Chips de {{nombre_titular}}, {{empresa}}, {{fecha}}, {{numero_solicitud}}, {{dias_bloqueo}}, {{fecha_vencimiento}}.</w:t>
+            </w:r>
+          </w:p>
+        </w:tc>
+      </w:tr>
+      <w:tr>
+        <w:tc>
+          <w:tcPr>
+            <w:tcW w:type="dxa" w:w="1701"/>
+          </w:tcPr>
+          <w:p>
+            <w:r>
+              <w:rPr>
+                <w:sz w:val="18"/>
+              </w:rPr>
+              <w:t>ARCO-QW8: banner SLA en FlujoModal</w:t>
+            </w:r>
+          </w:p>
+        </w:tc>
+        <w:tc>
+          <w:tcPr>
+            <w:tcW w:type="dxa" w:w="850"/>
+          </w:tcPr>
+          <w:p>
+            <w:r>
+              <w:rPr>
+                <w:sz w:val="18"/>
+              </w:rPr>
+              <w:t>MEDIO</w:t>
+            </w:r>
+          </w:p>
+        </w:tc>
+        <w:tc>
+          <w:tcPr>
+            <w:tcW w:type="dxa" w:w="2268"/>
+          </w:tcPr>
+          <w:p>
+            <w:r>
+              <w:rPr>
+                <w:sz w:val="18"/>
+              </w:rPr>
+              <w:t>frontend-next/components/arco/FlujoModal.tsx</w:t>
+            </w:r>
+          </w:p>
+        </w:tc>
+        <w:tc>
+          <w:tcPr>
+            <w:tcW w:type="dxa" w:w="5386"/>
+          </w:tcPr>
+          <w:p>
+            <w:r>
+              <w:rPr>
+                <w:sz w:val="18"/>
+              </w:rPr>
+              <w:t>Semáforo verde/amarillo/rojo con días hábiles consumidos y restantes respecto al SLA legal (10 días hábiles Art. 12).</w:t>
+            </w:r>
+          </w:p>
+        </w:tc>
+      </w:tr>
+      <w:tr>
+        <w:tc>
+          <w:tcPr>
+            <w:tcW w:type="dxa" w:w="1701"/>
+          </w:tcPr>
+          <w:p>
+            <w:r>
+              <w:rPr>
+                <w:sz w:val="18"/>
+              </w:rPr>
+              <w:t>Empresas-QW6: CompanyFichaPanel</w:t>
+            </w:r>
+          </w:p>
+        </w:tc>
+        <w:tc>
+          <w:tcPr>
+            <w:tcW w:type="dxa" w:w="850"/>
+          </w:tcPr>
+          <w:p>
+            <w:r>
+              <w:rPr>
+                <w:sz w:val="18"/>
+              </w:rPr>
+              <w:t>ALTO</w:t>
+            </w:r>
+          </w:p>
+        </w:tc>
+        <w:tc>
+          <w:tcPr>
+            <w:tcW w:type="dxa" w:w="2268"/>
+          </w:tcPr>
+          <w:p>
+            <w:r>
+              <w:rPr>
+                <w:sz w:val="18"/>
+              </w:rPr>
+              <w:t>frontend-next/components/companies/CompanyFichaPanel.tsx</w:t>
+            </w:r>
+          </w:p>
+        </w:tc>
+        <w:tc>
+          <w:tcPr>
+            <w:tcW w:type="dxa" w:w="5386"/>
+          </w:tcPr>
+          <w:p>
+            <w:r>
+              <w:rPr>
+                <w:sz w:val="18"/>
+              </w:rPr>
+              <w:t>Panel con 4 tabs lazy: Datos (edición), RATs, ARCO (tickets), Brechas.</w:t>
+            </w:r>
+          </w:p>
+        </w:tc>
+      </w:tr>
+      <w:tr>
+        <w:tc>
+          <w:tcPr>
+            <w:tcW w:type="dxa" w:w="1701"/>
+          </w:tcPr>
+          <w:p>
+            <w:r>
+              <w:rPr>
+                <w:sz w:val="18"/>
+              </w:rPr>
+              <w:t>CI/CD: pip-audit CVE scan</w:t>
+            </w:r>
+          </w:p>
+        </w:tc>
+        <w:tc>
+          <w:tcPr>
+            <w:tcW w:type="dxa" w:w="850"/>
+          </w:tcPr>
+          <w:p>
+            <w:r>
+              <w:rPr>
+                <w:sz w:val="18"/>
+              </w:rPr>
+              <w:t>ALTO</w:t>
+            </w:r>
+          </w:p>
+        </w:tc>
+        <w:tc>
+          <w:tcPr>
+            <w:tcW w:type="dxa" w:w="2268"/>
+          </w:tcPr>
+          <w:p>
+            <w:r>
+              <w:rPr>
+                <w:sz w:val="18"/>
+              </w:rPr>
+              <w:t>.github/workflows/tests.yml</w:t>
+            </w:r>
+          </w:p>
+        </w:tc>
+        <w:tc>
+          <w:tcPr>
+            <w:tcW w:type="dxa" w:w="5386"/>
+          </w:tcPr>
+          <w:p>
+            <w:r>
+              <w:rPr>
+                <w:sz w:val="18"/>
+              </w:rPr>
+              <w:t>CRITICAL bloquea deploy; HIGH genera advertencia. Env vars ALLOWED_ORIGINS y ENVIRONMENT hardcodeados para tests.</w:t>
+            </w:r>
+          </w:p>
+        </w:tc>
+      </w:tr>
+      <w:tr>
+        <w:tc>
+          <w:tcPr>
+            <w:tcW w:type="dxa" w:w="1701"/>
+          </w:tcPr>
+          <w:p>
+            <w:r>
+              <w:rPr>
+                <w:sz w:val="18"/>
+              </w:rPr>
+              <w:t>Nomenclatura: APDC → APDP</w:t>
+            </w:r>
+          </w:p>
+        </w:tc>
+        <w:tc>
+          <w:tcPr>
+            <w:tcW w:type="dxa" w:w="850"/>
+          </w:tcPr>
+          <w:p>
+            <w:r>
+              <w:rPr>
+                <w:sz w:val="18"/>
+              </w:rPr>
+              <w:t>MEDIO</w:t>
+            </w:r>
+          </w:p>
+        </w:tc>
+        <w:tc>
+          <w:tcPr>
+            <w:tcW w:type="dxa" w:w="2268"/>
+          </w:tcPr>
+          <w:p>
+            <w:r>
+              <w:rPr>
+                <w:sz w:val="18"/>
+              </w:rPr>
+              <w:t>Global (código, tests, docs)</w:t>
+            </w:r>
+          </w:p>
+        </w:tc>
+        <w:tc>
+          <w:tcPr>
+            <w:tcW w:type="dxa" w:w="5386"/>
+          </w:tcPr>
+          <w:p>
+            <w:r>
+              <w:rPr>
+                <w:sz w:val="18"/>
+              </w:rPr>
+              <w:t>Toda referencia a la agencia reguladora usa 'APDP' (Agencia de Protección de Datos Personales).</w:t>
+            </w:r>
+          </w:p>
+        </w:tc>
+      </w:tr>
+    </w:tbl>
     <w:sectPr>
+      <w:headerReference w:type="default" r:id="rId9"/>
+      <w:footerReference w:type="default" r:id="rId10"/>
       <w:pgSz w:w="12240" w:h="15840"/>
-      <w:pgMar w:top="1440" w:right="1800" w:bottom="1440" w:left="1800" w:header="720" w:footer="720" w:gutter="0"/>
+      <w:pgMar w:top="1417" w:right="1134" w:bottom="1417" w:left="1134" w:header="720" w:footer="720" w:gutter="0"/>
       <w:cols w:space="720"/>
+      <w:titlePg/>
       <w:docGrid w:linePitch="360"/>
     </w:sectPr>
   </w:body>
 </w:document>
+</file>
+
+<file path=word/footer1.xml><?xml version="1.0" encoding="utf-8"?>
+<w:ftr xmlns:m="http://schemas.openxmlformats.org/officeDocument/2006/math" xmlns:mc="http://schemas.openxmlformats.org/markup-compatibility/2006" xmlns:mo="http://schemas.microsoft.com/office/mac/office/2008/main" xmlns:mv="urn:schemas-microsoft-com:mac:vml" xmlns:o="urn:schemas-microsoft-com:office:office" xmlns:r="http://schemas.openxmlformats.org/officeDocument/2006/relationships" xmlns:v="urn:schemas-microsoft-com:vml" xmlns:w10="urn:schemas-microsoft-com:office:word" xmlns:w14="http://schemas.microsoft.com/office/word/2010/wordml" xmlns:w="http://schemas.openxmlformats.org/wordprocessingml/2006/main" xmlns:wne="http://schemas.microsoft.com/office/word/2006/wordml" xmlns:wp14="http://schemas.microsoft.com/office/word/2010/wordprocessingDrawing" xmlns:wp="http://schemas.openxmlformats.org/drawingml/2006/wordprocessingDrawing" xmlns:wpc="http://schemas.microsoft.com/office/word/2010/wordprocessingCanvas" xmlns:wpg="http://schemas.microsoft.com/office/word/2010/wordprocessingGroup" xmlns:wpi="http://schemas.microsoft.com/office/word/2010/wordprocessingInk" xmlns:wps="http://schemas.microsoft.com/office/word/2010/wordprocessingShape" mc:Ignorable="w14 wp14">
+  <w:p>
+    <w:pPr>
+      <w:pStyle w:val="Footer"/>
+      <w:jc w:val="center"/>
+    </w:pPr>
+    <w:r/>
+  </w:p>
+  <w:tbl>
+    <w:tblPr>
+      <w:tblW w:type="auto" w:w="0"/>
+      <w:tblLayout w:type="fixed"/>
+      <w:tblLook w:firstColumn="1" w:firstRow="1" w:lastColumn="0" w:lastRow="0" w:noHBand="0" w:noVBand="1" w:val="04A0"/>
+    </w:tblPr>
+    <w:tblGrid>
+      <w:gridCol w:w="3402"/>
+      <w:gridCol w:w="3169"/>
+      <w:gridCol w:w="3402"/>
+    </w:tblGrid>
+    <w:tr>
+      <w:tc>
+        <w:tcPr>
+          <w:tcW w:type="dxa" w:w="3402"/>
+        </w:tcPr>
+        <w:p>
+          <w:pPr>
+            <w:jc w:val="left"/>
+          </w:pPr>
+          <w:r>
+            <w:rPr>
+              <w:color w:val="808080"/>
+              <w:sz w:val="16"/>
+            </w:rPr>
+            <w:t>Custodio RAT Manager · Ley 21.719</w:t>
+          </w:r>
+        </w:p>
+      </w:tc>
+      <w:tc>
+        <w:tcPr>
+          <w:tcW w:type="dxa" w:w="3169"/>
+        </w:tcPr>
+        <w:p>
+          <w:pPr>
+            <w:jc w:val="center"/>
+          </w:pPr>
+          <w:r>
+            <w:rPr>
+              <w:color w:val="808080"/>
+              <w:sz w:val="16"/>
+            </w:rPr>
+            <w:t xml:space="preserve">Página </w:t>
+          </w:r>
+          <w:r>
+            <w:rPr>
+              <w:color w:val="808080"/>
+              <w:sz w:val="16"/>
+            </w:rPr>
+            <w:fldChar w:fldCharType="begin"/>
+            <w:instrText xml:space="preserve">PAGE</w:instrText>
+            <w:fldChar w:fldCharType="separate"/>
+            <w:fldChar w:fldCharType="end"/>
+          </w:r>
+          <w:r>
+            <w:rPr>
+              <w:color w:val="808080"/>
+              <w:sz w:val="16"/>
+            </w:rPr>
+            <w:t xml:space="preserve"> de </w:t>
+          </w:r>
+          <w:r>
+            <w:rPr>
+              <w:color w:val="808080"/>
+              <w:sz w:val="16"/>
+            </w:rPr>
+            <w:fldChar w:fldCharType="begin"/>
+            <w:instrText xml:space="preserve">NUMPAGES</w:instrText>
+            <w:fldChar w:fldCharType="separate"/>
+            <w:fldChar w:fldCharType="end"/>
+          </w:r>
+        </w:p>
+      </w:tc>
+      <w:tc>
+        <w:tcPr>
+          <w:tcW w:type="dxa" w:w="3402"/>
+        </w:tcPr>
+        <w:p>
+          <w:pPr>
+            <w:jc w:val="right"/>
+          </w:pPr>
+          <w:r>
+            <w:rPr>
+              <w:color w:val="808080"/>
+              <w:sz w:val="16"/>
+            </w:rPr>
+            <w:t>Interno — Confidencial  ·  Manual Técnico</w:t>
+          </w:r>
+        </w:p>
+      </w:tc>
+    </w:tr>
+  </w:tbl>
+</w:ftr>
+</file>
+
+<file path=word/header1.xml><?xml version="1.0" encoding="utf-8"?>
+<w:hdr xmlns:m="http://schemas.openxmlformats.org/officeDocument/2006/math" xmlns:mc="http://schemas.openxmlformats.org/markup-compatibility/2006" xmlns:mo="http://schemas.microsoft.com/office/mac/office/2008/main" xmlns:mv="urn:schemas-microsoft-com:mac:vml" xmlns:o="urn:schemas-microsoft-com:office:office" xmlns:r="http://schemas.openxmlformats.org/officeDocument/2006/relationships" xmlns:v="urn:schemas-microsoft-com:vml" xmlns:w10="urn:schemas-microsoft-com:office:word" xmlns:w14="http://schemas.microsoft.com/office/word/2010/wordml" xmlns:w="http://schemas.openxmlformats.org/wordprocessingml/2006/main" xmlns:wne="http://schemas.microsoft.com/office/word/2006/wordml" xmlns:wp14="http://schemas.microsoft.com/office/word/2010/wordprocessingDrawing" xmlns:wp="http://schemas.openxmlformats.org/drawingml/2006/wordprocessingDrawing" xmlns:wpc="http://schemas.microsoft.com/office/word/2010/wordprocessingCanvas" xmlns:wpg="http://schemas.microsoft.com/office/word/2010/wordprocessingGroup" xmlns:wpi="http://schemas.microsoft.com/office/word/2010/wordprocessingInk" xmlns:wps="http://schemas.microsoft.com/office/word/2010/wordprocessingShape" mc:Ignorable="w14 wp14">
+  <w:p>
+    <w:pPr>
+      <w:pStyle w:val="Header"/>
+    </w:pPr>
+    <w:r/>
+  </w:p>
+  <w:tbl>
+    <w:tblPr>
+      <w:tblW w:type="auto" w:w="0"/>
+      <w:tblLayout w:type="fixed"/>
+      <w:tblLook w:firstColumn="1" w:firstRow="1" w:lastColumn="0" w:lastRow="0" w:noHBand="0" w:noVBand="1" w:val="04A0"/>
+    </w:tblPr>
+    <w:tblGrid>
+      <w:gridCol w:w="5669"/>
+      <w:gridCol w:w="4303"/>
+    </w:tblGrid>
+    <w:tr>
+      <w:tc>
+        <w:tcPr>
+          <w:tcW w:type="dxa" w:w="5669"/>
+        </w:tcPr>
+        <w:p>
+          <w:pPr>
+            <w:jc w:val="left"/>
+            <w:pBdr>
+              <w:bottom w:val="single" w:sz="6" w:space="1" w:color="1F497D"/>
+            </w:pBdr>
+          </w:pPr>
+          <w:r>
+            <w:rPr>
+              <w:b/>
+              <w:color w:val="1F497D"/>
+              <w:sz w:val="18"/>
+            </w:rPr>
+            <w:t xml:space="preserve">▣  CUSTODIO  </w:t>
+          </w:r>
+          <w:r>
+            <w:rPr>
+              <w:color w:val="404040"/>
+              <w:sz w:val="18"/>
+            </w:rPr>
+            <w:t>·  Manual Técnico</w:t>
+          </w:r>
+        </w:p>
+      </w:tc>
+      <w:tc>
+        <w:tcPr>
+          <w:tcW w:type="dxa" w:w="4303"/>
+        </w:tcPr>
+        <w:p>
+          <w:pPr>
+            <w:jc w:val="right"/>
+          </w:pPr>
+          <w:r>
+            <w:rPr>
+              <w:color w:val="808080"/>
+              <w:sz w:val="18"/>
+            </w:rPr>
+            <w:t>v1.10  ·  Junio 2026</w:t>
+          </w:r>
+        </w:p>
+      </w:tc>
+    </w:tr>
+  </w:tbl>
+</w:hdr>
 </file>
 
 <file path=word/numbering.xml><?xml version="1.0" encoding="utf-8"?>
@@ -1723,8 +3426,12 @@
     <w:name w:val="Normal"/>
     <w:qFormat/>
     <w:rsid w:val="00FC693F"/>
+    <w:pPr>
+      <w:spacing w:after="120" w:line="276" w:lineRule="auto"/>
+    </w:pPr>
     <w:rPr>
       <w:rFonts w:ascii="Calibri" w:hAnsi="Calibri"/>
+      <w:color w:val="000000"/>
       <w:sz w:val="22"/>
     </w:rPr>
   </w:style>
@@ -1783,7 +3490,7 @@
     <w:pPr>
       <w:keepNext/>
       <w:keepLines/>
-      <w:spacing w:before="480" w:after="0"/>
+      <w:spacing w:before="360" w:after="120"/>
       <w:outlineLvl w:val="0"/>
     </w:pPr>
     <w:rPr>
@@ -1807,7 +3514,7 @@
     <w:pPr>
       <w:keepNext/>
       <w:keepLines/>
-      <w:spacing w:before="200" w:after="0"/>
+      <w:spacing w:before="240" w:after="80"/>
       <w:outlineLvl w:val="1"/>
     </w:pPr>
     <w:rPr>
@@ -1831,7 +3538,7 @@
     <w:pPr>
       <w:keepNext/>
       <w:keepLines/>
-      <w:spacing w:before="200" w:after="0"/>
+      <w:spacing w:before="160" w:after="40"/>
       <w:outlineLvl w:val="2"/>
     </w:pPr>
     <w:rPr>
@@ -1859,12 +3566,13 @@
       <w:outlineLvl w:val="3"/>
     </w:pPr>
     <w:rPr>
-      <w:rFonts w:asciiTheme="majorHAnsi" w:eastAsiaTheme="majorEastAsia" w:hAnsiTheme="majorHAnsi" w:cstheme="majorBidi"/>
+      <w:rFonts w:asciiTheme="majorHAnsi" w:eastAsiaTheme="majorEastAsia" w:hAnsiTheme="majorHAnsi" w:cstheme="majorBidi" w:ascii="Calibri" w:hAnsi="Calibri"/>
       <w:b/>
       <w:bCs/>
       <w:i/>
       <w:iCs/>
-      <w:color w:val="4F81BD" w:themeColor="accent1"/>
+      <w:color w:val="404040"/>
+      <w:sz w:val="22"/>
     </w:rPr>
   </w:style>
   <w:style w:type="paragraph" w:styleId="Heading5">

</xml_diff>